<commit_message>
Fill in student ID and name; redo Q3 with student ID as MQTT account
Co-Authored-By: Claude Opus 5.5 <noreply@anthropic.com>
Claude-Session: https://claude.ai/code/session_01Qk1r5LCPhzPwNxHsC9nyKE
</commit_message>
<xml_diff>
--- a/lab3/Lab_3_report.docx
+++ b/lab3/Lab_3_report.docx
@@ -44,7 +44,7 @@
         <w:rPr>
           <w:rFonts w:ascii="Times New Roman" w:eastAsia="標楷體" w:hAnsi="Times New Roman" w:cs="Times New Roman"/>
         </w:rPr>
-        <w:t>:_____</w:t>
+        <w:t>: 112652006</w:t>
       </w:r>
       <w:r>
         <w:rPr>
@@ -62,7 +62,7 @@
         <w:rPr>
           <w:rFonts w:ascii="Times New Roman" w:eastAsia="標楷體" w:hAnsi="Times New Roman" w:cs="Times New Roman"/>
         </w:rPr>
-        <w:t>:_____</w:t>
+        <w:t>: 陳昱翰</w:t>
       </w:r>
     </w:p>
     <w:p>
@@ -1459,7 +1459,7 @@
           <w:b w:val="0"/>
           <w:color w:val="1F4E79"/>
         </w:rPr>
-        <w:t xml:space="preserve"> 建立帳號（-c 會新建 passwd 檔），建立後 /etc/mosquitto 下多了 passwd，內容為「帳號:雜湊後的密碼」。</w:t>
+        <w:t xml:space="preserve"> 建立帳號（本次帳號設為學號 112652006，密碼 123456；-c 會新建 passwd 檔），建立後 /etc/mosquitto 下多了 passwd，內容為「帳號:雜湊後的密碼」。</w:t>
       </w:r>
     </w:p>
     <w:p>

</xml_diff>

<commit_message>
Rewrite report answers in plainer wording and use black text
Co-Authored-By: Claude Opus 5.5 <noreply@anthropic.com>
Claude-Session: https://claude.ai/code/session_01Qk1r5LCPhzPwNxHsC9nyKE
</commit_message>
<xml_diff>
--- a/lab3/Lab_3_report.docx
+++ b/lab3/Lab_3_report.docx
@@ -233,10 +233,9 @@
       <w:r>
         <w:rPr>
           <w:rFonts w:ascii="Times New Roman" w:hAnsi="Times New Roman" w:cs="Times New Roman" w:eastAsia="標楷體"/>
-          <w:b/>
-          <w:color w:val="1F4E79"/>
-        </w:rPr>
-        <w:t>Ans：不能。</w:t>
+          <w:b w:val="0"/>
+        </w:rPr>
+        <w:t>Ans: 不能。</w:t>
       </w:r>
     </w:p>
     <w:p>
@@ -247,134 +246,20 @@
         <w:rPr>
           <w:rFonts w:ascii="Times New Roman" w:hAnsi="Times New Roman" w:cs="Times New Roman" w:eastAsia="標楷體"/>
           <w:b w:val="0"/>
-          <w:color w:val="1F4E79"/>
-        </w:rPr>
-        <w:t xml:space="preserve">MQTT 的 topic 以「/」作為階層分隔符號，開頭的「/」本身也會切出一個「空字串」的層級。因此 </w:t>
-      </w:r>
-      <w:r>
-        <w:rPr>
-          <w:rFonts w:ascii="Courier New" w:hAnsi="Courier New" w:cs="Courier New" w:eastAsia="標楷體"/>
-          <w:b w:val="0"/>
-          <w:color w:val="1F4E79"/>
-        </w:rPr>
-        <w:t>/a/test</w:t>
-      </w:r>
+        </w:rPr>
+        <w:t>因為topic是用 "/" 來分層的，/a/test 開頭多了一個 "/"，所以第一層其實是空的，總共有三層（空、a、test），而 a/test 只有兩層（a、test）。沒有用萬用字元的話，每一層都要一樣才會收到，所以訂閱 /a/test 收不到 a/test 的訊息。</w:t>
+      </w:r>
+    </w:p>
+    <w:p>
+      <w:pPr>
+        <w:spacing w:after="80"/>
+      </w:pPr>
       <w:r>
         <w:rPr>
           <w:rFonts w:ascii="Times New Roman" w:hAnsi="Times New Roman" w:cs="Times New Roman" w:eastAsia="標楷體"/>
           <w:b w:val="0"/>
-          <w:color w:val="1F4E79"/>
-        </w:rPr>
-        <w:t xml:space="preserve"> 共有 3 層（""、"a"、"test"），而 </w:t>
-      </w:r>
-      <w:r>
-        <w:rPr>
-          <w:rFonts w:ascii="Courier New" w:hAnsi="Courier New" w:cs="Courier New" w:eastAsia="標楷體"/>
-          <w:b w:val="0"/>
-          <w:color w:val="1F4E79"/>
-        </w:rPr>
-        <w:t>a/test</w:t>
-      </w:r>
-      <w:r>
-        <w:rPr>
-          <w:rFonts w:ascii="Times New Roman" w:hAnsi="Times New Roman" w:cs="Times New Roman" w:eastAsia="標楷體"/>
-          <w:b w:val="0"/>
-          <w:color w:val="1F4E79"/>
-        </w:rPr>
-        <w:t xml:space="preserve"> 只有 2 層（"a"、"test"）。訂閱的 topic 沒有使用萬用字元（+、#）時，必須每一層都完全相同才算匹配；兩者層數不同、第一層也不同（"" ≠ "a"），所以訂閱 </w:t>
-      </w:r>
-      <w:r>
-        <w:rPr>
-          <w:rFonts w:ascii="Courier New" w:hAnsi="Courier New" w:cs="Courier New" w:eastAsia="標楷體"/>
-          <w:b w:val="0"/>
-          <w:color w:val="1F4E79"/>
-        </w:rPr>
-        <w:t>/a/test</w:t>
-      </w:r>
-      <w:r>
-        <w:rPr>
-          <w:rFonts w:ascii="Times New Roman" w:hAnsi="Times New Roman" w:cs="Times New Roman" w:eastAsia="標楷體"/>
-          <w:b w:val="0"/>
-          <w:color w:val="1F4E79"/>
-        </w:rPr>
-        <w:t xml:space="preserve"> 的 subscriber 收不到發佈到 </w:t>
-      </w:r>
-      <w:r>
-        <w:rPr>
-          <w:rFonts w:ascii="Courier New" w:hAnsi="Courier New" w:cs="Courier New" w:eastAsia="標楷體"/>
-          <w:b w:val="0"/>
-          <w:color w:val="1F4E79"/>
-        </w:rPr>
-        <w:t>a/test</w:t>
-      </w:r>
-      <w:r>
-        <w:rPr>
-          <w:rFonts w:ascii="Times New Roman" w:hAnsi="Times New Roman" w:cs="Times New Roman" w:eastAsia="標楷體"/>
-          <w:b w:val="0"/>
-          <w:color w:val="1F4E79"/>
-        </w:rPr>
-        <w:t xml:space="preserve"> 的訊息。</w:t>
-      </w:r>
-    </w:p>
-    <w:p>
-      <w:pPr>
-        <w:spacing w:after="80"/>
-      </w:pPr>
-      <w:r>
-        <w:rPr>
-          <w:rFonts w:ascii="Times New Roman" w:hAnsi="Times New Roman" w:cs="Times New Roman" w:eastAsia="標楷體"/>
-          <w:b w:val="0"/>
-          <w:color w:val="1F4E79"/>
-        </w:rPr>
-        <w:t xml:space="preserve">實驗驗證：Terminal 1 訂閱 </w:t>
-      </w:r>
-      <w:r>
-        <w:rPr>
-          <w:rFonts w:ascii="Courier New" w:hAnsi="Courier New" w:cs="Courier New" w:eastAsia="標楷體"/>
-          <w:b w:val="0"/>
-          <w:color w:val="1F4E79"/>
-        </w:rPr>
-        <w:t>/a/test</w:t>
-      </w:r>
-      <w:r>
-        <w:rPr>
-          <w:rFonts w:ascii="Times New Roman" w:hAnsi="Times New Roman" w:cs="Times New Roman" w:eastAsia="標楷體"/>
-          <w:b w:val="0"/>
-          <w:color w:val="1F4E79"/>
-        </w:rPr>
-        <w:t xml:space="preserve">，Terminal 2 先 publish 到 </w:t>
-      </w:r>
-      <w:r>
-        <w:rPr>
-          <w:rFonts w:ascii="Courier New" w:hAnsi="Courier New" w:cs="Courier New" w:eastAsia="標楷體"/>
-          <w:b w:val="0"/>
-          <w:color w:val="1F4E79"/>
-        </w:rPr>
-        <w:t>a/test</w:t>
-      </w:r>
-      <w:r>
-        <w:rPr>
-          <w:rFonts w:ascii="Times New Roman" w:hAnsi="Times New Roman" w:cs="Times New Roman" w:eastAsia="標楷體"/>
-          <w:b w:val="0"/>
-          <w:color w:val="1F4E79"/>
-        </w:rPr>
-        <w:t xml:space="preserve">（test_q1），subscriber 沒有任何輸出；再 publish 到 </w:t>
-      </w:r>
-      <w:r>
-        <w:rPr>
-          <w:rFonts w:ascii="Courier New" w:hAnsi="Courier New" w:cs="Courier New" w:eastAsia="標楷體"/>
-          <w:b w:val="0"/>
-          <w:color w:val="1F4E79"/>
-        </w:rPr>
-        <w:t>/a/test</w:t>
-      </w:r>
-      <w:r>
-        <w:rPr>
-          <w:rFonts w:ascii="Times New Roman" w:hAnsi="Times New Roman" w:cs="Times New Roman" w:eastAsia="標楷體"/>
-          <w:b w:val="0"/>
-          <w:color w:val="1F4E79"/>
-        </w:rPr>
-        <w:t>（test_q1_compare）作對照，subscriber 才收到訊息。</w:t>
+        </w:rPr>
+        <w:t>實際測試時，pub 到 a/test 的 test_q1 沒有收到，改 pub 到 /a/test 才有收到。</w:t>
       </w:r>
     </w:p>
     <w:p>
@@ -425,10 +310,9 @@
         <w:rPr>
           <w:rFonts w:ascii="Times New Roman" w:hAnsi="Times New Roman" w:cs="Times New Roman" w:eastAsia="標楷體"/>
           <w:b w:val="0"/>
-          <w:color w:val="595959"/>
           <w:sz w:val="20"/>
         </w:rPr>
-        <w:t>圖 1　Q1 測試：只有 /a/test 的訊息被收到，a/test 的 test_q1 沒有出現</w:t>
+        <w:t>圖1  Q1測試結果</w:t>
       </w:r>
     </w:p>
     <w:p>
@@ -439,7 +323,6 @@
         <w:rPr>
           <w:rFonts w:ascii="Times New Roman" w:hAnsi="Times New Roman" w:cs="Times New Roman" w:eastAsia="標楷體"/>
           <w:b w:val="0"/>
-          <w:color w:val="1F4E79"/>
         </w:rPr>
       </w:r>
     </w:p>
@@ -1023,252 +906,96 @@
       <w:r>
         <w:rPr>
           <w:rFonts w:ascii="Times New Roman" w:hAnsi="Times New Roman" w:cs="Times New Roman" w:eastAsia="標楷體"/>
-          <w:b/>
-          <w:color w:val="1F4E79"/>
-        </w:rPr>
-        <w:t>Ans：</w:t>
-      </w:r>
-    </w:p>
-    <w:p>
-      <w:pPr>
-        <w:spacing w:after="80"/>
+          <w:b w:val="0"/>
+        </w:rPr>
+        <w:t>Ans:</w:t>
+      </w:r>
+    </w:p>
+    <w:p>
+      <w:pPr>
+        <w:spacing w:after="0"/>
         <w:ind w:left="288"/>
       </w:pPr>
       <w:r>
         <w:rPr>
           <w:rFonts w:ascii="Times New Roman" w:hAnsi="Times New Roman" w:cs="Times New Roman" w:eastAsia="標楷體"/>
           <w:b w:val="0"/>
-          <w:color w:val="1F4E79"/>
-        </w:rPr>
-        <w:t>(1) 所有 roof 在 day 的 brightness：</w:t>
-      </w:r>
-      <w:r>
-        <w:rPr>
-          <w:rFonts w:ascii="Courier New" w:hAnsi="Courier New" w:cs="Courier New" w:eastAsia="標楷體"/>
-          <w:b/>
-          <w:color w:val="1F4E79"/>
-        </w:rPr>
-        <w:t>+/roof/brightness/day</w:t>
-      </w:r>
+        </w:rPr>
+        <w:t>1. +/roof/brightness/day</w:t>
+      </w:r>
+    </w:p>
+    <w:p>
+      <w:pPr>
+        <w:spacing w:after="0"/>
+        <w:ind w:left="288"/>
+      </w:pPr>
       <w:r>
         <w:rPr>
           <w:rFonts w:ascii="Times New Roman" w:hAnsi="Times New Roman" w:cs="Times New Roman" w:eastAsia="標楷體"/>
           <w:b w:val="0"/>
-          <w:color w:val="1F4E79"/>
-        </w:rPr>
-        <w:t xml:space="preserve">　→ 實測收到 2 則</w:t>
-      </w:r>
-    </w:p>
-    <w:p>
-      <w:pPr>
-        <w:spacing w:after="80"/>
+        </w:rPr>
+        <w:t>2. house1/firstfloor/#</w:t>
+      </w:r>
+    </w:p>
+    <w:p>
+      <w:pPr>
+        <w:spacing w:after="0"/>
         <w:ind w:left="288"/>
       </w:pPr>
       <w:r>
         <w:rPr>
           <w:rFonts w:ascii="Times New Roman" w:hAnsi="Times New Roman" w:cs="Times New Roman" w:eastAsia="標楷體"/>
           <w:b w:val="0"/>
-          <w:color w:val="1F4E79"/>
-        </w:rPr>
-        <w:t>(2) house1 firstfloor 的所有內容：</w:t>
-      </w:r>
-      <w:r>
-        <w:rPr>
-          <w:rFonts w:ascii="Courier New" w:hAnsi="Courier New" w:cs="Courier New" w:eastAsia="標楷體"/>
-          <w:b/>
-          <w:color w:val="1F4E79"/>
-        </w:rPr>
-        <w:t>house1/firstfloor/#</w:t>
-      </w:r>
+        </w:rPr>
+        <w:t>3. house2/+/+/night</w:t>
+      </w:r>
+    </w:p>
+    <w:p>
+      <w:pPr>
+        <w:spacing w:after="0"/>
+        <w:ind w:left="288"/>
+      </w:pPr>
       <w:r>
         <w:rPr>
           <w:rFonts w:ascii="Times New Roman" w:hAnsi="Times New Roman" w:cs="Times New Roman" w:eastAsia="標楷體"/>
           <w:b w:val="0"/>
-          <w:color w:val="1F4E79"/>
-        </w:rPr>
-        <w:t xml:space="preserve">（亦可寫成 </w:t>
-      </w:r>
-      <w:r>
-        <w:rPr>
-          <w:rFonts w:ascii="Courier New" w:hAnsi="Courier New" w:cs="Courier New" w:eastAsia="標楷體"/>
-          <w:b w:val="0"/>
-          <w:color w:val="1F4E79"/>
-        </w:rPr>
-        <w:t>house1/firstfloor/+/+</w:t>
-      </w:r>
+        </w:rPr>
+        <w:t>4. +/roof/#</w:t>
+      </w:r>
+    </w:p>
+    <w:p>
+      <w:pPr>
+        <w:spacing w:after="0"/>
+      </w:pPr>
       <w:r>
         <w:rPr>
           <w:rFonts w:ascii="Times New Roman" w:hAnsi="Times New Roman" w:cs="Times New Roman" w:eastAsia="標楷體"/>
           <w:b w:val="0"/>
-          <w:color w:val="1F4E79"/>
-        </w:rPr>
-        <w:t>）</w:t>
-      </w:r>
+        </w:rPr>
+      </w:r>
+    </w:p>
+    <w:p>
+      <w:pPr>
+        <w:spacing w:after="80"/>
+      </w:pPr>
       <w:r>
         <w:rPr>
           <w:rFonts w:ascii="Times New Roman" w:hAnsi="Times New Roman" w:cs="Times New Roman" w:eastAsia="標楷體"/>
           <w:b w:val="0"/>
-          <w:color w:val="1F4E79"/>
-        </w:rPr>
-        <w:t xml:space="preserve">　→ 實測收到 6 則</w:t>
+        </w:rPr>
+        <w:t>+ 只能代表一層，# 可以代表後面所有層，但只能放在最後面。第1、3題是中間某幾層不限定，所以用 +；第2、4題是要某一層以下的全部內容，所以用 #。</w:t>
       </w:r>
     </w:p>
     <w:p>
       <w:pPr>
         <w:spacing w:after="80"/>
-        <w:ind w:left="288"/>
       </w:pPr>
       <w:r>
         <w:rPr>
           <w:rFonts w:ascii="Times New Roman" w:hAnsi="Times New Roman" w:cs="Times New Roman" w:eastAsia="標楷體"/>
           <w:b w:val="0"/>
-          <w:color w:val="1F4E79"/>
-        </w:rPr>
-        <w:t>(3) house2 在 night 的所有內容：</w:t>
-      </w:r>
-      <w:r>
-        <w:rPr>
-          <w:rFonts w:ascii="Courier New" w:hAnsi="Courier New" w:cs="Courier New" w:eastAsia="標楷體"/>
-          <w:b/>
-          <w:color w:val="1F4E79"/>
-        </w:rPr>
-        <w:t>house2/+/+/night</w:t>
-      </w:r>
-      <w:r>
-        <w:rPr>
-          <w:rFonts w:ascii="Times New Roman" w:hAnsi="Times New Roman" w:cs="Times New Roman" w:eastAsia="標楷體"/>
-          <w:b w:val="0"/>
-          <w:color w:val="1F4E79"/>
-        </w:rPr>
-        <w:t xml:space="preserve">　→ 實測收到 9 則</w:t>
-      </w:r>
-    </w:p>
-    <w:p>
-      <w:pPr>
-        <w:spacing w:after="80"/>
-        <w:ind w:left="288"/>
-      </w:pPr>
-      <w:r>
-        <w:rPr>
-          <w:rFonts w:ascii="Times New Roman" w:hAnsi="Times New Roman" w:cs="Times New Roman" w:eastAsia="標楷體"/>
-          <w:b w:val="0"/>
-          <w:color w:val="1F4E79"/>
-        </w:rPr>
-        <w:t>(4) 所有 roof 的所有內容：</w:t>
-      </w:r>
-      <w:r>
-        <w:rPr>
-          <w:rFonts w:ascii="Courier New" w:hAnsi="Courier New" w:cs="Courier New" w:eastAsia="標楷體"/>
-          <w:b/>
-          <w:color w:val="1F4E79"/>
-        </w:rPr>
-        <w:t>+/roof/#</w:t>
-      </w:r>
-      <w:r>
-        <w:rPr>
-          <w:rFonts w:ascii="Times New Roman" w:hAnsi="Times New Roman" w:cs="Times New Roman" w:eastAsia="標楷體"/>
-          <w:b w:val="0"/>
-          <w:color w:val="1F4E79"/>
-        </w:rPr>
-        <w:t xml:space="preserve">（亦可寫成 </w:t>
-      </w:r>
-      <w:r>
-        <w:rPr>
-          <w:rFonts w:ascii="Courier New" w:hAnsi="Courier New" w:cs="Courier New" w:eastAsia="標楷體"/>
-          <w:b w:val="0"/>
-          <w:color w:val="1F4E79"/>
-        </w:rPr>
-        <w:t>+/roof/+/+</w:t>
-      </w:r>
-      <w:r>
-        <w:rPr>
-          <w:rFonts w:ascii="Times New Roman" w:hAnsi="Times New Roman" w:cs="Times New Roman" w:eastAsia="標楷體"/>
-          <w:b w:val="0"/>
-          <w:color w:val="1F4E79"/>
-        </w:rPr>
-        <w:t>）</w:t>
-      </w:r>
-      <w:r>
-        <w:rPr>
-          <w:rFonts w:ascii="Times New Roman" w:hAnsi="Times New Roman" w:cs="Times New Roman" w:eastAsia="標楷體"/>
-          <w:b w:val="0"/>
-          <w:color w:val="1F4E79"/>
-        </w:rPr>
-        <w:t xml:space="preserve">　→ 實測收到 12 則</w:t>
-      </w:r>
-    </w:p>
-    <w:p>
-      <w:pPr>
-        <w:spacing w:after="80"/>
-      </w:pPr>
-      <w:r>
-        <w:rPr>
-          <w:rFonts w:ascii="Times New Roman" w:hAnsi="Times New Roman" w:cs="Times New Roman" w:eastAsia="標楷體"/>
-          <w:b w:val="0"/>
-          <w:color w:val="1F4E79"/>
-        </w:rPr>
-        <w:t>說明：「+」只能代表「單一」階層，可放在任何位置；「#」代表其後的任意多個階層，只能放在最後一層。第 (1)(3) 題要固定某幾層、其他單層任意，所以用「+」；第 (2)(4) 題要某層以下的所有內容，所以在結尾用「#」。將 2×3×3×2 = 36 種 topic 全部 publish 一次，四個 subscriber 分別只收到 2、6、9、12 則，與預期相符。</w:t>
-      </w:r>
-    </w:p>
-    <w:p>
-      <w:pPr>
-        <w:spacing w:after="80"/>
-      </w:pPr>
-      <w:r>
-        <w:rPr>
-          <w:rFonts w:ascii="Times New Roman" w:hAnsi="Times New Roman" w:cs="Times New Roman" w:eastAsia="標楷體"/>
-          <w:b w:val="0"/>
-          <w:color w:val="1F4E79"/>
-        </w:rPr>
-        <w:t xml:space="preserve">補充：若題目格式中最後的「/」代表實際 topic 結尾真的有一個「/」（例如 </w:t>
-      </w:r>
-      <w:r>
-        <w:rPr>
-          <w:rFonts w:ascii="Courier New" w:hAnsi="Courier New" w:cs="Courier New" w:eastAsia="標楷體"/>
-          <w:b w:val="0"/>
-          <w:color w:val="1F4E79"/>
-        </w:rPr>
-        <w:t>house1/roof/brightness/day/</w:t>
-      </w:r>
-      <w:r>
-        <w:rPr>
-          <w:rFonts w:ascii="Times New Roman" w:hAnsi="Times New Roman" w:cs="Times New Roman" w:eastAsia="標楷體"/>
-          <w:b w:val="0"/>
-          <w:color w:val="1F4E79"/>
-        </w:rPr>
-        <w:t xml:space="preserve">），則 (1)(3) 需寫成 </w:t>
-      </w:r>
-      <w:r>
-        <w:rPr>
-          <w:rFonts w:ascii="Courier New" w:hAnsi="Courier New" w:cs="Courier New" w:eastAsia="標楷體"/>
-          <w:b w:val="0"/>
-          <w:color w:val="1F4E79"/>
-        </w:rPr>
-        <w:t>+/roof/brightness/day/</w:t>
-      </w:r>
-      <w:r>
-        <w:rPr>
-          <w:rFonts w:ascii="Times New Roman" w:hAnsi="Times New Roman" w:cs="Times New Roman" w:eastAsia="標楷體"/>
-          <w:b w:val="0"/>
-          <w:color w:val="1F4E79"/>
-        </w:rPr>
-        <w:t>、</w:t>
-      </w:r>
-      <w:r>
-        <w:rPr>
-          <w:rFonts w:ascii="Courier New" w:hAnsi="Courier New" w:cs="Courier New" w:eastAsia="標楷體"/>
-          <w:b w:val="0"/>
-          <w:color w:val="1F4E79"/>
-        </w:rPr>
-        <w:t>house2/+/+/night/</w:t>
-      </w:r>
-      <w:r>
-        <w:rPr>
-          <w:rFonts w:ascii="Times New Roman" w:hAnsi="Times New Roman" w:cs="Times New Roman" w:eastAsia="標楷體"/>
-          <w:b w:val="0"/>
-          <w:color w:val="1F4E79"/>
-        </w:rPr>
-        <w:t>（多一個空的最後層），(2)(4) 用「#」的寫法不受影響。</w:t>
+        </w:rPr>
+        <w:t>我把36種topic全部pub一次，四個subscriber分別收到2、6、9、12筆，跟算出來的一樣。</w:t>
       </w:r>
     </w:p>
     <w:p>
@@ -1319,10 +1046,9 @@
         <w:rPr>
           <w:rFonts w:ascii="Times New Roman" w:hAnsi="Times New Roman" w:cs="Times New Roman" w:eastAsia="標楷體"/>
           <w:b w:val="0"/>
-          <w:color w:val="595959"/>
           <w:sz w:val="20"/>
         </w:rPr>
-        <w:t>圖 2　Q2 測試：四個 subscriber 同時訂閱，publisher 送出全部 36 種 topic</w:t>
+        <w:t>圖2  Q2測試結果</w:t>
       </w:r>
     </w:p>
     <w:p>
@@ -1333,7 +1059,6 @@
         <w:rPr>
           <w:rFonts w:ascii="Times New Roman" w:hAnsi="Times New Roman" w:cs="Times New Roman" w:eastAsia="標楷體"/>
           <w:b w:val="0"/>
-          <w:color w:val="1F4E79"/>
         </w:rPr>
       </w:r>
     </w:p>
@@ -1422,198 +1147,25 @@
     <w:p>
       <w:pPr>
         <w:spacing w:after="80"/>
-      </w:pPr>
-      <w:r>
-        <w:rPr>
-          <w:rFonts w:ascii="Times New Roman" w:hAnsi="Times New Roman" w:cs="Times New Roman" w:eastAsia="標楷體"/>
-          <w:b/>
-          <w:color w:val="1F4E79"/>
-        </w:rPr>
-        <w:t>步驟：</w:t>
-      </w:r>
-    </w:p>
-    <w:p>
-      <w:pPr>
-        <w:spacing w:after="80"/>
-        <w:ind w:left="288"/>
       </w:pPr>
       <w:r>
         <w:rPr>
           <w:rFonts w:ascii="Times New Roman" w:hAnsi="Times New Roman" w:cs="Times New Roman" w:eastAsia="標楷體"/>
           <w:b w:val="0"/>
-          <w:color w:val="1F4E79"/>
-        </w:rPr>
-        <w:t xml:space="preserve">用 </w:t>
-      </w:r>
-      <w:r>
-        <w:rPr>
-          <w:rFonts w:ascii="Courier New" w:hAnsi="Courier New" w:cs="Courier New" w:eastAsia="標楷體"/>
-          <w:b w:val="0"/>
-          <w:color w:val="1F4E79"/>
-        </w:rPr>
-        <w:t>sudo mosquitto_passwd -c /etc/mosquitto/passwd &lt;帳號&gt;</w:t>
-      </w:r>
+        </w:rPr>
+        <w:t>先用 mosquitto_passwd 建立帳號（帳號112652006，密碼123456），再到 mosquitto.conf 加上 password_file /etc/mosquitto/passwd 和 allow_anonymous false，然後 restart mosquitto。（我用的 mosquitto 是2.0版，要多加一行 listener 1883 才會擋匿名。）</w:t>
+      </w:r>
+    </w:p>
+    <w:p>
+      <w:pPr>
+        <w:spacing w:after="80"/>
+      </w:pPr>
       <w:r>
         <w:rPr>
           <w:rFonts w:ascii="Times New Roman" w:hAnsi="Times New Roman" w:cs="Times New Roman" w:eastAsia="標楷體"/>
           <w:b w:val="0"/>
-          <w:color w:val="1F4E79"/>
-        </w:rPr>
-        <w:t xml:space="preserve"> 建立帳號（本次帳號設為學號 112652006，密碼 123456；-c 會新建 passwd 檔），建立後 /etc/mosquitto 下多了 passwd，內容為「帳號:雜湊後的密碼」。</w:t>
-      </w:r>
-    </w:p>
-    <w:p>
-      <w:pPr>
-        <w:spacing w:after="80"/>
-        <w:ind w:left="288"/>
-      </w:pPr>
-      <w:r>
-        <w:rPr>
-          <w:rFonts w:ascii="Times New Roman" w:hAnsi="Times New Roman" w:cs="Times New Roman" w:eastAsia="標楷體"/>
-          <w:b w:val="0"/>
-          <w:color w:val="1F4E79"/>
-        </w:rPr>
-        <w:t xml:space="preserve">在 </w:t>
-      </w:r>
-      <w:r>
-        <w:rPr>
-          <w:rFonts w:ascii="Courier New" w:hAnsi="Courier New" w:cs="Courier New" w:eastAsia="標楷體"/>
-          <w:b w:val="0"/>
-          <w:color w:val="1F4E79"/>
-        </w:rPr>
-        <w:t>/etc/mosquitto/mosquitto.conf</w:t>
-      </w:r>
-      <w:r>
-        <w:rPr>
-          <w:rFonts w:ascii="Times New Roman" w:hAnsi="Times New Roman" w:cs="Times New Roman" w:eastAsia="標楷體"/>
-          <w:b w:val="0"/>
-          <w:color w:val="1F4E79"/>
-        </w:rPr>
-        <w:t xml:space="preserve"> 加入 </w:t>
-      </w:r>
-      <w:r>
-        <w:rPr>
-          <w:rFonts w:ascii="Courier New" w:hAnsi="Courier New" w:cs="Courier New" w:eastAsia="標楷體"/>
-          <w:b w:val="0"/>
-          <w:color w:val="1F4E79"/>
-        </w:rPr>
-        <w:t>password_file /etc/mosquitto/passwd</w:t>
-      </w:r>
-      <w:r>
-        <w:rPr>
-          <w:rFonts w:ascii="Times New Roman" w:hAnsi="Times New Roman" w:cs="Times New Roman" w:eastAsia="標楷體"/>
-          <w:b w:val="0"/>
-          <w:color w:val="1F4E79"/>
-        </w:rPr>
-        <w:t xml:space="preserve"> 與 </w:t>
-      </w:r>
-      <w:r>
-        <w:rPr>
-          <w:rFonts w:ascii="Courier New" w:hAnsi="Courier New" w:cs="Courier New" w:eastAsia="標楷體"/>
-          <w:b w:val="0"/>
-          <w:color w:val="1F4E79"/>
-        </w:rPr>
-        <w:t>allow_anonymous false</w:t>
-      </w:r>
-      <w:r>
-        <w:rPr>
-          <w:rFonts w:ascii="Times New Roman" w:hAnsi="Times New Roman" w:cs="Times New Roman" w:eastAsia="標楷體"/>
-          <w:b w:val="0"/>
-          <w:color w:val="1F4E79"/>
-        </w:rPr>
-        <w:t xml:space="preserve">，並 </w:t>
-      </w:r>
-      <w:r>
-        <w:rPr>
-          <w:rFonts w:ascii="Courier New" w:hAnsi="Courier New" w:cs="Courier New" w:eastAsia="標楷體"/>
-          <w:b w:val="0"/>
-          <w:color w:val="1F4E79"/>
-        </w:rPr>
-        <w:t>sudo service mosquitto restart</w:t>
-      </w:r>
-      <w:r>
-        <w:rPr>
-          <w:rFonts w:ascii="Times New Roman" w:hAnsi="Times New Roman" w:cs="Times New Roman" w:eastAsia="標楷體"/>
-          <w:b w:val="0"/>
-          <w:color w:val="1F4E79"/>
-        </w:rPr>
-        <w:t>。</w:t>
-      </w:r>
-    </w:p>
-    <w:p>
-      <w:pPr>
-        <w:spacing w:after="80"/>
-        <w:ind w:left="288"/>
-      </w:pPr>
-      <w:r>
-        <w:rPr>
-          <w:rFonts w:ascii="Times New Roman" w:hAnsi="Times New Roman" w:cs="Times New Roman" w:eastAsia="標楷體"/>
-          <w:b w:val="0"/>
-          <w:color w:val="1F4E79"/>
-        </w:rPr>
-        <w:t xml:space="preserve">注意：mosquitto 2.x 若設定檔中沒有任何 listener，會進入 local only mode，此時 allow_anonymous false 不會生效，因此要另外加上 </w:t>
-      </w:r>
-      <w:r>
-        <w:rPr>
-          <w:rFonts w:ascii="Courier New" w:hAnsi="Courier New" w:cs="Courier New" w:eastAsia="標楷體"/>
-          <w:b w:val="0"/>
-          <w:color w:val="1F4E79"/>
-        </w:rPr>
-        <w:t>listener 1883</w:t>
-      </w:r>
-      <w:r>
-        <w:rPr>
-          <w:rFonts w:ascii="Times New Roman" w:hAnsi="Times New Roman" w:cs="Times New Roman" w:eastAsia="標楷體"/>
-          <w:b w:val="0"/>
-          <w:color w:val="1F4E79"/>
-        </w:rPr>
-        <w:t>。</w:t>
-      </w:r>
-    </w:p>
-    <w:p>
-      <w:pPr>
-        <w:spacing w:after="80"/>
-        <w:ind w:left="288"/>
-      </w:pPr>
-      <w:r>
-        <w:rPr>
-          <w:rFonts w:ascii="Times New Roman" w:hAnsi="Times New Roman" w:cs="Times New Roman" w:eastAsia="標楷體"/>
-          <w:b w:val="0"/>
-          <w:color w:val="1F4E79"/>
-        </w:rPr>
-        <w:t xml:space="preserve">結果：未帶帳密（匿名）或密碼錯誤的 sub / pub 都被拒絕（Connection Refused: not authorised）；帶正確的 </w:t>
-      </w:r>
-      <w:r>
-        <w:rPr>
-          <w:rFonts w:ascii="Courier New" w:hAnsi="Courier New" w:cs="Courier New" w:eastAsia="標楷體"/>
-          <w:b w:val="0"/>
-          <w:color w:val="1F4E79"/>
-        </w:rPr>
-        <w:t>-u</w:t>
-      </w:r>
-      <w:r>
-        <w:rPr>
-          <w:rFonts w:ascii="Times New Roman" w:hAnsi="Times New Roman" w:cs="Times New Roman" w:eastAsia="標楷體"/>
-          <w:b w:val="0"/>
-          <w:color w:val="1F4E79"/>
-        </w:rPr>
-        <w:t xml:space="preserve"> / </w:t>
-      </w:r>
-      <w:r>
-        <w:rPr>
-          <w:rFonts w:ascii="Courier New" w:hAnsi="Courier New" w:cs="Courier New" w:eastAsia="標楷體"/>
-          <w:b w:val="0"/>
-          <w:color w:val="1F4E79"/>
-        </w:rPr>
-        <w:t>-P</w:t>
-      </w:r>
-      <w:r>
-        <w:rPr>
-          <w:rFonts w:ascii="Times New Roman" w:hAnsi="Times New Roman" w:cs="Times New Roman" w:eastAsia="標楷體"/>
-          <w:b w:val="0"/>
-          <w:color w:val="1F4E79"/>
-        </w:rPr>
-        <w:t xml:space="preserve"> 後即可正常訂閱與發佈。</w:t>
+        </w:rPr>
+        <w:t>之後不加帳密直接 sub 或 pub 都會出現 not authorised，密碼打錯也一樣，加上 -u 112652006 -P 123456 才能正常收發。</w:t>
       </w:r>
     </w:p>
     <w:p>
@@ -1664,10 +1216,9 @@
         <w:rPr>
           <w:rFonts w:ascii="Times New Roman" w:hAnsi="Times New Roman" w:cs="Times New Roman" w:eastAsia="標楷體"/>
           <w:b w:val="0"/>
-          <w:color w:val="595959"/>
           <w:sz w:val="20"/>
         </w:rPr>
-        <w:t>圖 3　建立帳號、檢視 passwd、修改 mosquitto.conf 並重啟 broker</w:t>
+        <w:t>圖3  建立帳號、修改設定檔並重啟</w:t>
       </w:r>
     </w:p>
     <w:p>
@@ -1718,10 +1269,9 @@
         <w:rPr>
           <w:rFonts w:ascii="Times New Roman" w:hAnsi="Times New Roman" w:cs="Times New Roman" w:eastAsia="標楷體"/>
           <w:b w:val="0"/>
-          <w:color w:val="595959"/>
           <w:sz w:val="20"/>
         </w:rPr>
-        <w:t>圖 4　匿名 / 錯誤密碼被拒；使用帳號密碼後 subscriber 成功收到訊息</w:t>
+        <w:t>圖4  匿名被拒絕，用帳密可以正常收發</w:t>
       </w:r>
     </w:p>
     <w:p>
@@ -1732,7 +1282,6 @@
         <w:rPr>
           <w:rFonts w:ascii="Times New Roman" w:hAnsi="Times New Roman" w:cs="Times New Roman" w:eastAsia="標楷體"/>
           <w:b w:val="0"/>
-          <w:color w:val="1F4E79"/>
         </w:rPr>
       </w:r>
     </w:p>
@@ -1936,12 +1485,11 @@
             </w:pPr>
             <w:r>
               <w:rPr>
-                <w:rFonts w:ascii="Courier New" w:hAnsi="Courier New" w:cs="Courier New" w:eastAsia="標楷體"/>
+                <w:rFonts w:ascii="Times New Roman" w:hAnsi="Times New Roman" w:cs="Times New Roman" w:eastAsia="標楷體"/>
                 <w:b w:val="0"/>
-                <w:color w:val="1F4E79"/>
                 <w:sz w:val="22"/>
               </w:rPr>
-              <w:t>in　msg1</w:t>
+              <w:t>in  msg1</w:t>
             </w:r>
           </w:p>
         </w:tc>
@@ -1961,10 +1509,9 @@
               <w:rPr>
                 <w:rFonts w:ascii="Times New Roman" w:hAnsi="Times New Roman" w:cs="Times New Roman" w:eastAsia="標楷體"/>
                 <w:b w:val="0"/>
-                <w:color w:val="1F4E79"/>
                 <w:sz w:val="22"/>
               </w:rPr>
-              <w:t>（收不到）</w:t>
+              <w:t>無</w:t>
             </w:r>
           </w:p>
         </w:tc>
@@ -2022,12 +1569,11 @@
             </w:pPr>
             <w:r>
               <w:rPr>
-                <w:rFonts w:ascii="Courier New" w:hAnsi="Courier New" w:cs="Courier New" w:eastAsia="標楷體"/>
+                <w:rFonts w:ascii="Times New Roman" w:hAnsi="Times New Roman" w:cs="Times New Roman" w:eastAsia="標楷體"/>
                 <w:b w:val="0"/>
-                <w:color w:val="1F4E79"/>
                 <w:sz w:val="22"/>
               </w:rPr>
-              <w:t>out　msg2</w:t>
+              <w:t>out  msg2</w:t>
             </w:r>
           </w:p>
         </w:tc>
@@ -2045,12 +1591,11 @@
             </w:pPr>
             <w:r>
               <w:rPr>
-                <w:rFonts w:ascii="Courier New" w:hAnsi="Courier New" w:cs="Courier New" w:eastAsia="標楷體"/>
+                <w:rFonts w:ascii="Times New Roman" w:hAnsi="Times New Roman" w:cs="Times New Roman" w:eastAsia="標楷體"/>
                 <w:b w:val="0"/>
-                <w:color w:val="1F4E79"/>
                 <w:sz w:val="22"/>
               </w:rPr>
-              <w:t>fromA/out　msg2</w:t>
+              <w:t>fromA/out  msg2</w:t>
             </w:r>
           </w:p>
         </w:tc>
@@ -2108,12 +1653,11 @@
             </w:pPr>
             <w:r>
               <w:rPr>
-                <w:rFonts w:ascii="Courier New" w:hAnsi="Courier New" w:cs="Courier New" w:eastAsia="標楷體"/>
+                <w:rFonts w:ascii="Times New Roman" w:hAnsi="Times New Roman" w:cs="Times New Roman" w:eastAsia="標楷體"/>
                 <w:b w:val="0"/>
-                <w:color w:val="1F4E79"/>
                 <w:sz w:val="22"/>
               </w:rPr>
-              <w:t>out/msg　msg3</w:t>
+              <w:t>out/msg  msg3</w:t>
             </w:r>
           </w:p>
         </w:tc>
@@ -2131,12 +1675,11 @@
             </w:pPr>
             <w:r>
               <w:rPr>
-                <w:rFonts w:ascii="Courier New" w:hAnsi="Courier New" w:cs="Courier New" w:eastAsia="標楷體"/>
+                <w:rFonts w:ascii="Times New Roman" w:hAnsi="Times New Roman" w:cs="Times New Roman" w:eastAsia="標楷體"/>
                 <w:b w:val="0"/>
-                <w:color w:val="1F4E79"/>
                 <w:sz w:val="22"/>
               </w:rPr>
-              <w:t>fromA/msg　msg3</w:t>
+              <w:t>fromA/msg  msg3</w:t>
             </w:r>
           </w:p>
         </w:tc>
@@ -2194,12 +1737,11 @@
             </w:pPr>
             <w:r>
               <w:rPr>
-                <w:rFonts w:ascii="Courier New" w:hAnsi="Courier New" w:cs="Courier New" w:eastAsia="標楷體"/>
+                <w:rFonts w:ascii="Times New Roman" w:hAnsi="Times New Roman" w:cs="Times New Roman" w:eastAsia="標楷體"/>
                 <w:b w:val="0"/>
-                <w:color w:val="1F4E79"/>
                 <w:sz w:val="22"/>
               </w:rPr>
-              <w:t>/out　msg4</w:t>
+              <w:t>/out  msg4</w:t>
             </w:r>
           </w:p>
         </w:tc>
@@ -2219,10 +1761,9 @@
               <w:rPr>
                 <w:rFonts w:ascii="Times New Roman" w:hAnsi="Times New Roman" w:cs="Times New Roman" w:eastAsia="標楷體"/>
                 <w:b w:val="0"/>
-                <w:color w:val="1F4E79"/>
                 <w:sz w:val="22"/>
               </w:rPr>
-              <w:t>（收不到）</w:t>
+              <w:t>無</w:t>
             </w:r>
           </w:p>
         </w:tc>
@@ -2280,12 +1821,11 @@
             </w:pPr>
             <w:r>
               <w:rPr>
-                <w:rFonts w:ascii="Courier New" w:hAnsi="Courier New" w:cs="Courier New" w:eastAsia="標楷體"/>
+                <w:rFonts w:ascii="Times New Roman" w:hAnsi="Times New Roman" w:cs="Times New Roman" w:eastAsia="標楷體"/>
                 <w:b w:val="0"/>
-                <w:color w:val="1F4E79"/>
                 <w:sz w:val="22"/>
               </w:rPr>
-              <w:t>fromB/out　msg5</w:t>
+              <w:t>fromB/out  msg5</w:t>
             </w:r>
           </w:p>
         </w:tc>
@@ -2303,12 +1843,11 @@
             </w:pPr>
             <w:r>
               <w:rPr>
-                <w:rFonts w:ascii="Courier New" w:hAnsi="Courier New" w:cs="Courier New" w:eastAsia="標楷體"/>
+                <w:rFonts w:ascii="Times New Roman" w:hAnsi="Times New Roman" w:cs="Times New Roman" w:eastAsia="標楷體"/>
                 <w:b w:val="0"/>
-                <w:color w:val="1F4E79"/>
                 <w:sz w:val="22"/>
               </w:rPr>
-              <w:t>out　msg5</w:t>
+              <w:t>out  msg5</w:t>
             </w:r>
           </w:p>
         </w:tc>
@@ -2375,12 +1914,11 @@
             </w:pPr>
             <w:r>
               <w:rPr>
-                <w:rFonts w:ascii="Courier New" w:hAnsi="Courier New" w:cs="Courier New" w:eastAsia="標楷體"/>
+                <w:rFonts w:ascii="Times New Roman" w:hAnsi="Times New Roman" w:cs="Times New Roman" w:eastAsia="標楷體"/>
                 <w:b w:val="0"/>
-                <w:color w:val="1F4E79"/>
                 <w:sz w:val="22"/>
               </w:rPr>
-              <w:t>fromB/fromB　msg6</w:t>
+              <w:t>fromB/fromB  msg6</w:t>
             </w:r>
           </w:p>
         </w:tc>
@@ -2398,12 +1936,11 @@
             </w:pPr>
             <w:r>
               <w:rPr>
-                <w:rFonts w:ascii="Courier New" w:hAnsi="Courier New" w:cs="Courier New" w:eastAsia="標楷體"/>
+                <w:rFonts w:ascii="Times New Roman" w:hAnsi="Times New Roman" w:cs="Times New Roman" w:eastAsia="標楷體"/>
                 <w:b w:val="0"/>
-                <w:color w:val="1F4E79"/>
                 <w:sz w:val="22"/>
               </w:rPr>
-              <w:t>fromB　msg6</w:t>
+              <w:t>fromB  msg6</w:t>
             </w:r>
           </w:p>
         </w:tc>
@@ -2416,10 +1953,9 @@
       <w:r>
         <w:rPr>
           <w:rFonts w:ascii="Times New Roman" w:hAnsi="Times New Roman" w:cs="Times New Roman" w:eastAsia="標楷體"/>
-          <w:b/>
-          <w:color w:val="1F4E79"/>
-        </w:rPr>
-        <w:t>Bridge 設定（設在 Broker A / VM）：</w:t>
+          <w:b w:val="0"/>
+        </w:rPr>
+        <w:t>Bridge設在A（VM），設定如下：</w:t>
       </w:r>
     </w:p>
     <w:p>
@@ -2429,9 +1965,8 @@
       </w:pPr>
       <w:r>
         <w:rPr>
-          <w:rFonts w:ascii="Courier New" w:hAnsi="Courier New" w:cs="Courier New" w:eastAsia="標楷體"/>
+          <w:rFonts w:ascii="Times New Roman" w:hAnsi="Times New Roman" w:cs="Times New Roman" w:eastAsia="標楷體"/>
           <w:b w:val="0"/>
-          <w:color w:val="1F4E79"/>
         </w:rPr>
         <w:t>connection bridge-01</w:t>
       </w:r>
@@ -2443,11 +1978,10 @@
       </w:pPr>
       <w:r>
         <w:rPr>
-          <w:rFonts w:ascii="Courier New" w:hAnsi="Courier New" w:cs="Courier New" w:eastAsia="標楷體"/>
+          <w:rFonts w:ascii="Times New Roman" w:hAnsi="Times New Roman" w:cs="Times New Roman" w:eastAsia="標楷體"/>
           <w:b w:val="0"/>
-          <w:color w:val="1F4E79"/>
-        </w:rPr>
-        <w:t>address &lt;Pi板 IP&gt;:1883</w:t>
+        </w:rPr>
+        <w:t>address &lt;Pi板IP&gt;:1883</w:t>
       </w:r>
     </w:p>
     <w:p>
@@ -2457,9 +1991,8 @@
       </w:pPr>
       <w:r>
         <w:rPr>
-          <w:rFonts w:ascii="Courier New" w:hAnsi="Courier New" w:cs="Courier New" w:eastAsia="標楷體"/>
+          <w:rFonts w:ascii="Times New Roman" w:hAnsi="Times New Roman" w:cs="Times New Roman" w:eastAsia="標楷體"/>
           <w:b w:val="0"/>
-          <w:color w:val="1F4E79"/>
         </w:rPr>
         <w:t>topic # out 1 out/ fromA/</w:t>
       </w:r>
@@ -2471,22 +2004,20 @@
       </w:pPr>
       <w:r>
         <w:rPr>
-          <w:rFonts w:ascii="Courier New" w:hAnsi="Courier New" w:cs="Courier New" w:eastAsia="標楷體"/>
-          <w:b w:val="0"/>
-          <w:color w:val="1F4E79"/>
-        </w:rPr>
-        <w:t>topic # in 1 fromB/</w:t>
-      </w:r>
-    </w:p>
-    <w:p>
-      <w:pPr>
-        <w:spacing w:after="0"/>
-      </w:pPr>
-      <w:r>
-        <w:rPr>
           <w:rFonts w:ascii="Times New Roman" w:hAnsi="Times New Roman" w:cs="Times New Roman" w:eastAsia="標楷體"/>
           <w:b w:val="0"/>
-          <w:color w:val="1F4E79"/>
+        </w:rPr>
+        <w:t>topic # in 1 fromB/</w:t>
+      </w:r>
+    </w:p>
+    <w:p>
+      <w:pPr>
+        <w:spacing w:after="0"/>
+      </w:pPr>
+      <w:r>
+        <w:rPr>
+          <w:rFonts w:ascii="Times New Roman" w:hAnsi="Times New Roman" w:cs="Times New Roman" w:eastAsia="標楷體"/>
+          <w:b w:val="0"/>
         </w:rPr>
       </w:r>
     </w:p>
@@ -2497,10 +2028,9 @@
       <w:r>
         <w:rPr>
           <w:rFonts w:ascii="Times New Roman" w:hAnsi="Times New Roman" w:cs="Times New Roman" w:eastAsia="標楷體"/>
-          <w:b/>
-          <w:color w:val="1F4E79"/>
-        </w:rPr>
-        <w:t>結果說明：</w:t>
+          <w:b w:val="0"/>
+        </w:rPr>
+        <w:t>結果討論：</w:t>
       </w:r>
     </w:p>
     <w:p>
@@ -2512,57 +2042,47 @@
         <w:rPr>
           <w:rFonts w:ascii="Times New Roman" w:hAnsi="Times New Roman" w:cs="Times New Roman" w:eastAsia="標楷體"/>
           <w:b w:val="0"/>
-          <w:color w:val="1F4E79"/>
-        </w:rPr>
-        <w:t xml:space="preserve">out 規則：local-prefix 為 out/、remote-prefix 為 fromA/，A 會在本地訂閱 </w:t>
-      </w:r>
-      <w:r>
-        <w:rPr>
-          <w:rFonts w:ascii="Courier New" w:hAnsi="Courier New" w:cs="Courier New" w:eastAsia="標楷體"/>
-          <w:b w:val="0"/>
-          <w:color w:val="1F4E79"/>
-        </w:rPr>
-        <w:t>out/#</w:t>
-      </w:r>
+        </w:rPr>
+        <w:t>1. A的subscriber訂閱 #，所以A自己pub的訊息都會照原本的topic顯示。</w:t>
+      </w:r>
+    </w:p>
+    <w:p>
+      <w:pPr>
+        <w:spacing w:after="80"/>
+        <w:ind w:left="288"/>
+      </w:pPr>
       <w:r>
         <w:rPr>
           <w:rFonts w:ascii="Times New Roman" w:hAnsi="Times New Roman" w:cs="Times New Roman" w:eastAsia="標楷體"/>
           <w:b w:val="0"/>
-          <w:color w:val="1F4E79"/>
-        </w:rPr>
-        <w:t>，符合的訊息轉送給 B，並把開頭的 out/ 換成 fromA/。所以 msg3（</w:t>
-      </w:r>
-      <w:r>
-        <w:rPr>
-          <w:rFonts w:ascii="Courier New" w:hAnsi="Courier New" w:cs="Courier New" w:eastAsia="標楷體"/>
-          <w:b w:val="0"/>
-          <w:color w:val="1F4E79"/>
-        </w:rPr>
-        <w:t>out/msg</w:t>
-      </w:r>
+        </w:rPr>
+        <w:t>2. out那行的意思是A上 out/ 開頭的訊息會送到B，而且 out/ 會換成 fromA/，所以msg3在B變成 fromA/msg。</w:t>
+      </w:r>
+    </w:p>
+    <w:p>
+      <w:pPr>
+        <w:spacing w:after="80"/>
+        <w:ind w:left="288"/>
+      </w:pPr>
       <w:r>
         <w:rPr>
           <w:rFonts w:ascii="Times New Roman" w:hAnsi="Times New Roman" w:cs="Times New Roman" w:eastAsia="標楷體"/>
           <w:b w:val="0"/>
-          <w:color w:val="1F4E79"/>
-        </w:rPr>
-        <w:t xml:space="preserve">）在 B 顯示為 </w:t>
-      </w:r>
-      <w:r>
-        <w:rPr>
-          <w:rFonts w:ascii="Courier New" w:hAnsi="Courier New" w:cs="Courier New" w:eastAsia="標楷體"/>
-          <w:b w:val="0"/>
-          <w:color w:val="1F4E79"/>
-        </w:rPr>
-        <w:t>fromA/msg</w:t>
-      </w:r>
+        </w:rPr>
+        <w:t>3. msg2的topic只有 out，本來以為不會送過去，結果B收到 fromA/out。查了一下是因為 # 也會匹配上一層本身，所以 out 也符合 out/#，只是它沒有 out/ 可以換，就直接在前面加上 fromA/。</w:t>
+      </w:r>
+    </w:p>
+    <w:p>
+      <w:pPr>
+        <w:spacing w:after="80"/>
+        <w:ind w:left="288"/>
+      </w:pPr>
       <w:r>
         <w:rPr>
           <w:rFonts w:ascii="Times New Roman" w:hAnsi="Times New Roman" w:cs="Times New Roman" w:eastAsia="標楷體"/>
           <w:b w:val="0"/>
-          <w:color w:val="1F4E79"/>
-        </w:rPr>
-        <w:t>。</w:t>
+        </w:rPr>
+        <w:t>4. msg1（in）和msg4（/out）都不符合 out/#，所以只有A收得到，B收不到。</w:t>
       </w:r>
     </w:p>
     <w:p>
@@ -2574,193 +2094,8 @@
         <w:rPr>
           <w:rFonts w:ascii="Times New Roman" w:hAnsi="Times New Roman" w:cs="Times New Roman" w:eastAsia="標楷體"/>
           <w:b w:val="0"/>
-          <w:color w:val="1F4E79"/>
-        </w:rPr>
-        <w:t xml:space="preserve">msg2 的 topic 是 </w:t>
-      </w:r>
-      <w:r>
-        <w:rPr>
-          <w:rFonts w:ascii="Courier New" w:hAnsi="Courier New" w:cs="Courier New" w:eastAsia="標楷體"/>
-          <w:b w:val="0"/>
-          <w:color w:val="1F4E79"/>
-        </w:rPr>
-        <w:t>out</w:t>
-      </w:r>
-      <w:r>
-        <w:rPr>
-          <w:rFonts w:ascii="Times New Roman" w:hAnsi="Times New Roman" w:cs="Times New Roman" w:eastAsia="標楷體"/>
-          <w:b w:val="0"/>
-          <w:color w:val="1F4E79"/>
-        </w:rPr>
-        <w:t xml:space="preserve">：MQTT 的「#」也會匹配它的上一層本身，所以 </w:t>
-      </w:r>
-      <w:r>
-        <w:rPr>
-          <w:rFonts w:ascii="Courier New" w:hAnsi="Courier New" w:cs="Courier New" w:eastAsia="標楷體"/>
-          <w:b w:val="0"/>
-          <w:color w:val="1F4E79"/>
-        </w:rPr>
-        <w:t>out</w:t>
-      </w:r>
-      <w:r>
-        <w:rPr>
-          <w:rFonts w:ascii="Times New Roman" w:hAnsi="Times New Roman" w:cs="Times New Roman" w:eastAsia="標楷體"/>
-          <w:b w:val="0"/>
-          <w:color w:val="1F4E79"/>
-        </w:rPr>
-        <w:t xml:space="preserve"> 符合 </w:t>
-      </w:r>
-      <w:r>
-        <w:rPr>
-          <w:rFonts w:ascii="Courier New" w:hAnsi="Courier New" w:cs="Courier New" w:eastAsia="標楷體"/>
-          <w:b w:val="0"/>
-          <w:color w:val="1F4E79"/>
-        </w:rPr>
-        <w:t>out/#</w:t>
-      </w:r>
-      <w:r>
-        <w:rPr>
-          <w:rFonts w:ascii="Times New Roman" w:hAnsi="Times New Roman" w:cs="Times New Roman" w:eastAsia="標楷體"/>
-          <w:b w:val="0"/>
-          <w:color w:val="1F4E79"/>
-        </w:rPr>
-        <w:t xml:space="preserve"> 而被轉送；但它並不是以 "out/" 開頭，沒有前綴可以拿掉，於是只在前面加上 fromA/，B 看到 </w:t>
-      </w:r>
-      <w:r>
-        <w:rPr>
-          <w:rFonts w:ascii="Courier New" w:hAnsi="Courier New" w:cs="Courier New" w:eastAsia="標楷體"/>
-          <w:b w:val="0"/>
-          <w:color w:val="1F4E79"/>
-        </w:rPr>
-        <w:t>fromA/out</w:t>
-      </w:r>
-      <w:r>
-        <w:rPr>
-          <w:rFonts w:ascii="Times New Roman" w:hAnsi="Times New Roman" w:cs="Times New Roman" w:eastAsia="標楷體"/>
-          <w:b w:val="0"/>
-          <w:color w:val="1F4E79"/>
-        </w:rPr>
-        <w:t>。</w:t>
-      </w:r>
-    </w:p>
-    <w:p>
-      <w:pPr>
-        <w:spacing w:after="80"/>
-        <w:ind w:left="288"/>
-      </w:pPr>
-      <w:r>
-        <w:rPr>
-          <w:rFonts w:ascii="Times New Roman" w:hAnsi="Times New Roman" w:cs="Times New Roman" w:eastAsia="標楷體"/>
-          <w:b w:val="0"/>
-          <w:color w:val="1F4E79"/>
-        </w:rPr>
-        <w:t>msg1（</w:t>
-      </w:r>
-      <w:r>
-        <w:rPr>
-          <w:rFonts w:ascii="Courier New" w:hAnsi="Courier New" w:cs="Courier New" w:eastAsia="標楷體"/>
-          <w:b w:val="0"/>
-          <w:color w:val="1F4E79"/>
-        </w:rPr>
-        <w:t>in</w:t>
-      </w:r>
-      <w:r>
-        <w:rPr>
-          <w:rFonts w:ascii="Times New Roman" w:hAnsi="Times New Roman" w:cs="Times New Roman" w:eastAsia="標楷體"/>
-          <w:b w:val="0"/>
-          <w:color w:val="1F4E79"/>
-        </w:rPr>
-        <w:t>）與 msg4（</w:t>
-      </w:r>
-      <w:r>
-        <w:rPr>
-          <w:rFonts w:ascii="Courier New" w:hAnsi="Courier New" w:cs="Courier New" w:eastAsia="標楷體"/>
-          <w:b w:val="0"/>
-          <w:color w:val="1F4E79"/>
-        </w:rPr>
-        <w:t>/out</w:t>
-      </w:r>
-      <w:r>
-        <w:rPr>
-          <w:rFonts w:ascii="Times New Roman" w:hAnsi="Times New Roman" w:cs="Times New Roman" w:eastAsia="標楷體"/>
-          <w:b w:val="0"/>
-          <w:color w:val="1F4E79"/>
-        </w:rPr>
-        <w:t>，第一層是空字串而不是 out）都不符合 out/#，只留在 A，B 收不到。</w:t>
-      </w:r>
-    </w:p>
-    <w:p>
-      <w:pPr>
-        <w:spacing w:after="80"/>
-        <w:ind w:left="288"/>
-      </w:pPr>
-      <w:r>
-        <w:rPr>
-          <w:rFonts w:ascii="Times New Roman" w:hAnsi="Times New Roman" w:cs="Times New Roman" w:eastAsia="標楷體"/>
-          <w:b w:val="0"/>
-          <w:color w:val="1F4E79"/>
-        </w:rPr>
-        <w:t xml:space="preserve">in 規則：只有 local-prefix fromB/，沒有 remote-prefix，所以 A 在 B 上訂閱「#」，B 上所有訊息都會被帶回 A，並在 topic 前面加上 fromB/：msg5 → </w:t>
-      </w:r>
-      <w:r>
-        <w:rPr>
-          <w:rFonts w:ascii="Courier New" w:hAnsi="Courier New" w:cs="Courier New" w:eastAsia="標楷體"/>
-          <w:b w:val="0"/>
-          <w:color w:val="1F4E79"/>
-        </w:rPr>
-        <w:t>fromB/out</w:t>
-      </w:r>
-      <w:r>
-        <w:rPr>
-          <w:rFonts w:ascii="Times New Roman" w:hAnsi="Times New Roman" w:cs="Times New Roman" w:eastAsia="標楷體"/>
-          <w:b w:val="0"/>
-          <w:color w:val="1F4E79"/>
-        </w:rPr>
-        <w:t xml:space="preserve">、msg6 → </w:t>
-      </w:r>
-      <w:r>
-        <w:rPr>
-          <w:rFonts w:ascii="Courier New" w:hAnsi="Courier New" w:cs="Courier New" w:eastAsia="標楷體"/>
-          <w:b w:val="0"/>
-          <w:color w:val="1F4E79"/>
-        </w:rPr>
-        <w:t>fromB/fromB</w:t>
-      </w:r>
-      <w:r>
-        <w:rPr>
-          <w:rFonts w:ascii="Times New Roman" w:hAnsi="Times New Roman" w:cs="Times New Roman" w:eastAsia="標楷體"/>
-          <w:b w:val="0"/>
-          <w:color w:val="1F4E79"/>
-        </w:rPr>
-        <w:t>。B 自己的 subscriber 則照原 topic 顯示。</w:t>
-      </w:r>
-    </w:p>
-    <w:p>
-      <w:pPr>
-        <w:spacing w:after="80"/>
-        <w:ind w:left="288"/>
-      </w:pPr>
-      <w:r>
-        <w:rPr>
-          <w:rFonts w:ascii="Times New Roman" w:hAnsi="Times New Roman" w:cs="Times New Roman" w:eastAsia="標楷體"/>
-          <w:b w:val="0"/>
-          <w:color w:val="1F4E79"/>
-        </w:rPr>
-        <w:t>B 上的 fromA/… 訊息不會再被 in 規則帶回 A 形成迴圈，因為 mosquitto 的 bridge 連線會告知遠端 broker 不要把 bridge 自己送出的訊息再回送（no-local / try_private）。</w:t>
-      </w:r>
-    </w:p>
-    <w:p>
-      <w:pPr>
-        <w:spacing w:after="80"/>
-        <w:ind w:left="288"/>
-      </w:pPr>
-      <w:r>
-        <w:rPr>
-          <w:rFonts w:ascii="Times New Roman" w:hAnsi="Times New Roman" w:cs="Times New Roman" w:eastAsia="標楷體"/>
-          <w:b w:val="0"/>
-          <w:color w:val="1F4E79"/>
-        </w:rPr>
-        <w:t>A 的 subscriber 訂閱「#」，本地 publish 的訊息都會原樣顯示（out 規則只影響送往 B 的訊息，不影響 A 本地）。</w:t>
+        </w:rPr>
+        <w:t>5. in那行只有設local-prefix，所以B上的所有訊息都會傳回A，而且前面加上 fromB/，msg5、msg6在A分別變成 fromB/out 和 fromB/fromB，B自己則是照原本的topic顯示。</w:t>
       </w:r>
     </w:p>
     <w:p>
@@ -2811,10 +2146,9 @@
         <w:rPr>
           <w:rFonts w:ascii="Times New Roman" w:hAnsi="Times New Roman" w:cs="Times New Roman" w:eastAsia="標楷體"/>
           <w:b w:val="0"/>
-          <w:color w:val="595959"/>
           <w:sz w:val="20"/>
         </w:rPr>
-        <w:t>圖 5　在 Broker A 的 mosquitto.conf 加入 bridge 設定並重啟</w:t>
+        <w:t>圖5  在A加上bridge設定</w:t>
       </w:r>
     </w:p>
     <w:p>
@@ -2865,10 +2199,9 @@
         <w:rPr>
           <w:rFonts w:ascii="Times New Roman" w:hAnsi="Times New Roman" w:cs="Times New Roman" w:eastAsia="標楷體"/>
           <w:b w:val="0"/>
-          <w:color w:val="595959"/>
           <w:sz w:val="20"/>
         </w:rPr>
-        <w:t>圖 6　兩邊 client 皆訂閱 #，依表格順序 publish 的結果</w:t>
+        <w:t>圖6  Q4測試結果</w:t>
       </w:r>
     </w:p>
     <w:p>
@@ -2879,10 +2212,8 @@
         <w:rPr>
           <w:rFonts w:ascii="Times New Roman" w:hAnsi="Times New Roman" w:cs="Times New Roman" w:eastAsia="標楷體"/>
           <w:b w:val="0"/>
-          <w:color w:val="595959"/>
-          <w:sz w:val="20"/>
-        </w:rPr>
-        <w:t>註：此次截圖中的 Broker B 以同一台機器上 port 1884 的 mosquitto 代替 Pi 板（位址 127.0.0.1:1884），bridge 行為與連到 Pi 板相同。</w:t>
+        </w:rPr>
+        <w:t>註：這次的Broker B是用同一台電腦上port 1884的mosquitto代替Pi板。</w:t>
       </w:r>
     </w:p>
     <w:p>
@@ -2893,7 +2224,6 @@
         <w:rPr>
           <w:rFonts w:ascii="Times New Roman" w:hAnsi="Times New Roman" w:cs="Times New Roman" w:eastAsia="標楷體"/>
           <w:b w:val="0"/>
-          <w:color w:val="1F4E79"/>
         </w:rPr>
       </w:r>
     </w:p>
@@ -3030,37 +2360,25 @@
       <w:pPr>
         <w:spacing w:after="80"/>
       </w:pPr>
-      <w:r>
-        <w:rPr>
-          <w:rFonts w:ascii="Times New Roman" w:hAnsi="Times New Roman" w:cs="Times New Roman" w:eastAsia="標楷體"/>
-          <w:b/>
-          <w:color w:val="1F4E79"/>
-        </w:rPr>
-        <w:t>Ans：</w:t>
-      </w:r>
       <w:r>
         <w:rPr>
           <w:rFonts w:ascii="Times New Roman" w:hAnsi="Times New Roman" w:cs="Times New Roman" w:eastAsia="標楷體"/>
           <w:b w:val="0"/>
-          <w:color w:val="1F4E79"/>
-        </w:rPr>
-        <w:t xml:space="preserve">QoS 有 0、1、2 三種等級，數字越高傳遞保證越強，但交握次數與負擔也越大。bridge 設定 </w:t>
-      </w:r>
-      <w:r>
-        <w:rPr>
-          <w:rFonts w:ascii="Courier New" w:hAnsi="Courier New" w:cs="Courier New" w:eastAsia="標楷體"/>
-          <w:b w:val="0"/>
-          <w:color w:val="1F4E79"/>
-        </w:rPr>
-        <w:t>topic &lt;pattern&gt; &lt;direction&gt; &lt;qos&gt;</w:t>
-      </w:r>
+        </w:rPr>
+        <w:t>Ans: QoS有0、1、2三種。</w:t>
+      </w:r>
+    </w:p>
+    <w:p>
+      <w:pPr>
+        <w:spacing w:after="80"/>
+        <w:ind w:left="288"/>
+      </w:pPr>
       <w:r>
         <w:rPr>
           <w:rFonts w:ascii="Times New Roman" w:hAnsi="Times New Roman" w:cs="Times New Roman" w:eastAsia="標楷體"/>
           <w:b w:val="0"/>
-          <w:color w:val="1F4E79"/>
-        </w:rPr>
-        <w:t xml:space="preserve"> 中的 qos，是兩個 broker 之間轉送該 topic 時使用的 QoS。</w:t>
+        </w:rPr>
+        <w:t>QoS 0：最多送一次。送出去就不管了，對方也不用回應，所以有可能掉訊息，但速度最快。</w:t>
       </w:r>
     </w:p>
     <w:p>
@@ -3071,86 +2389,44 @@
       <w:r>
         <w:rPr>
           <w:rFonts w:ascii="Times New Roman" w:hAnsi="Times New Roman" w:cs="Times New Roman" w:eastAsia="標楷體"/>
-          <w:b/>
-          <w:color w:val="1F4E79"/>
-        </w:rPr>
-        <w:t>QoS 0 – At most once（最多一次）：</w:t>
-      </w:r>
+          <w:b w:val="0"/>
+        </w:rPr>
+        <w:t>QoS 1：至少送一次。對方收到要回PUBACK，沒收到回應就會重送，所以訊息不會掉，但可能會收到重複的。</w:t>
+      </w:r>
+    </w:p>
+    <w:p>
+      <w:pPr>
+        <w:spacing w:after="80"/>
+        <w:ind w:left="288"/>
+      </w:pPr>
       <w:r>
         <w:rPr>
           <w:rFonts w:ascii="Times New Roman" w:hAnsi="Times New Roman" w:cs="Times New Roman" w:eastAsia="標楷體"/>
           <w:b w:val="0"/>
-          <w:color w:val="1F4E79"/>
-        </w:rPr>
-        <w:t>送出 PUBLISH 後就不管了，接收端不回覆確認，也不重送。速度最快、負擔最小，但網路不穩時訊息可能遺失。適合頻繁更新、掉一筆也無所謂的感測資料。</w:t>
+        </w:rPr>
+        <w:t>QoS 2：剛好送一次。要經過PUBLISH、PUBREC、PUBREL、PUBCOMP四次交握，確保不會掉也不會重複，但最慢、負擔也最大。</w:t>
       </w:r>
     </w:p>
     <w:p>
       <w:pPr>
         <w:spacing w:after="80"/>
-        <w:ind w:left="288"/>
-      </w:pPr>
-      <w:r>
-        <w:rPr>
-          <w:rFonts w:ascii="Times New Roman" w:hAnsi="Times New Roman" w:cs="Times New Roman" w:eastAsia="標楷體"/>
-          <w:b/>
-          <w:color w:val="1F4E79"/>
-        </w:rPr>
-        <w:t>QoS 1 – At least once（至少一次）：</w:t>
-      </w:r>
+      </w:pPr>
       <w:r>
         <w:rPr>
           <w:rFonts w:ascii="Times New Roman" w:hAnsi="Times New Roman" w:cs="Times New Roman" w:eastAsia="標楷體"/>
           <w:b w:val="0"/>
-          <w:color w:val="1F4E79"/>
-        </w:rPr>
-        <w:t>接收端收到後回 PUBACK；傳送端在收到 PUBACK 前會保存訊息，逾時就重送（DUP 旗標）。保證送達，但可能因重送而收到重複訊息，接收端需能容忍重複。</w:t>
-      </w:r>
-    </w:p>
-    <w:p>
-      <w:pPr>
-        <w:spacing w:after="80"/>
-        <w:ind w:left="288"/>
-      </w:pPr>
-      <w:r>
-        <w:rPr>
-          <w:rFonts w:ascii="Times New Roman" w:hAnsi="Times New Roman" w:cs="Times New Roman" w:eastAsia="標楷體"/>
-          <w:b/>
-          <w:color w:val="1F4E79"/>
-        </w:rPr>
-        <w:t>QoS 2 – Exactly once（剛好一次）：</w:t>
-      </w:r>
+        </w:rPr>
+        <w:t>在bridge設定裡，topic後面的那個數字就是兩個broker之間傳這些topic時用的QoS，這次實驗設的是1。</w:t>
+      </w:r>
+    </w:p>
+    <w:p>
+      <w:pPr>
+        <w:spacing w:after="0"/>
+      </w:pPr>
       <w:r>
         <w:rPr>
           <w:rFonts w:ascii="Times New Roman" w:hAnsi="Times New Roman" w:cs="Times New Roman" w:eastAsia="標楷體"/>
           <w:b w:val="0"/>
-          <w:color w:val="1F4E79"/>
-        </w:rPr>
-        <w:t>以 PUBLISH → PUBREC → PUBREL → PUBCOMP 四次交握，雙方用 Packet ID 記錄狀態，保證訊息只被處理一次、不遺失也不重複。最可靠但延遲與負擔最大，適合計費、控制指令等不能重複的訊息。</w:t>
-      </w:r>
-    </w:p>
-    <w:p>
-      <w:pPr>
-        <w:spacing w:after="80"/>
-      </w:pPr>
-      <w:r>
-        <w:rPr>
-          <w:rFonts w:ascii="Times New Roman" w:hAnsi="Times New Roman" w:cs="Times New Roman" w:eastAsia="標楷體"/>
-          <w:b w:val="0"/>
-          <w:color w:val="1F4E79"/>
-        </w:rPr>
-        <w:t>實際送達的 QoS 會取「發佈端的 QoS」與「訂閱（或 bridge 設定）的 QoS」兩者中較低者。本實驗 bridge 設 QoS 1，代表兩個 broker 之間的轉送保證至少送達一次。</w:t>
-      </w:r>
-    </w:p>
-    <w:p>
-      <w:pPr>
-        <w:spacing w:after="0"/>
-      </w:pPr>
-      <w:r>
-        <w:rPr>
-          <w:rFonts w:ascii="Times New Roman" w:hAnsi="Times New Roman" w:cs="Times New Roman" w:eastAsia="標楷體"/>
-          <w:b w:val="0"/>
-          <w:color w:val="1F4E79"/>
         </w:rPr>
       </w:r>
     </w:p>
@@ -3834,311 +3110,129 @@
       <w:r>
         <w:rPr>
           <w:rFonts w:ascii="Times New Roman" w:hAnsi="Times New Roman" w:cs="Times New Roman" w:eastAsia="標楷體"/>
-          <w:b/>
-          <w:color w:val="1F4E79"/>
-        </w:rPr>
-        <w:t>Ans：</w:t>
+          <w:b w:val="0"/>
+        </w:rPr>
+        <w:t>Ans:</w:t>
       </w:r>
     </w:p>
     <w:p>
       <w:pPr>
         <w:spacing w:after="80"/>
       </w:pPr>
-      <w:r>
-        <w:rPr>
-          <w:rFonts w:ascii="Times New Roman" w:hAnsi="Times New Roman" w:cs="Times New Roman" w:eastAsia="標楷體"/>
-          <w:b/>
-          <w:color w:val="1F4E79"/>
-        </w:rPr>
-        <w:t>(1) true / false 的作用</w:t>
-      </w:r>
-    </w:p>
-    <w:p>
-      <w:pPr>
-        <w:spacing w:after="80"/>
-        <w:ind w:left="288"/>
-      </w:pPr>
-      <w:r>
-        <w:rPr>
-          <w:rFonts w:ascii="Times New Roman" w:hAnsi="Times New Roman" w:cs="Times New Roman" w:eastAsia="標楷體"/>
-          <w:b/>
-          <w:color w:val="1F4E79"/>
-        </w:rPr>
-        <w:t>cleansession true：</w:t>
-      </w:r>
       <w:r>
         <w:rPr>
           <w:rFonts w:ascii="Times New Roman" w:hAnsi="Times New Roman" w:cs="Times New Roman" w:eastAsia="標楷體"/>
           <w:b w:val="0"/>
-          <w:color w:val="1F4E79"/>
-        </w:rPr>
-        <w:t>bridge 以「乾淨的 session」連線到遠端 broker。連線中斷時，遠端 broker 會清除這個 bridge 的所有訂閱以及尚未送出的訊息；重新連線時一切重新開始，bridge 重新訂閱，斷線期間的訊息會遺失。</w:t>
+        </w:rPr>
+        <w:t>1. 設成true的話，bridge斷線時遠端broker會把它的訂閱和還沒送出的訊息都清掉，重新連線後要重新訂閱，斷線期間的訊息就收不到了。設成false（預設）的話，遠端broker會保留bridge的訂閱，斷線期間QoS 1、2的訊息也會先存起來，重連之後再補送。</w:t>
       </w:r>
     </w:p>
     <w:p>
       <w:pPr>
         <w:spacing w:after="80"/>
-        <w:ind w:left="288"/>
-      </w:pPr>
-      <w:r>
-        <w:rPr>
-          <w:rFonts w:ascii="Times New Roman" w:hAnsi="Times New Roman" w:cs="Times New Roman" w:eastAsia="標楷體"/>
-          <w:b/>
-          <w:color w:val="1F4E79"/>
-        </w:rPr>
-        <w:t>cleansession false（預設）：</w:t>
-      </w:r>
+      </w:pPr>
       <w:r>
         <w:rPr>
           <w:rFonts w:ascii="Times New Roman" w:hAnsi="Times New Roman" w:cs="Times New Roman" w:eastAsia="標楷體"/>
           <w:b w:val="0"/>
-          <w:color w:val="1F4E79"/>
-        </w:rPr>
-        <w:t>使用「持久 session」。遠端 broker 以 client id 記住 bridge 的訂閱，斷線時仍保留，並替它暫存斷線期間 QoS 1/2 的訊息；重連後繼續沿用原訂閱並補送這些訊息，不容易掉資料。</w:t>
+        </w:rPr>
+        <w:t>2. 如果是false，改了bridge的topic之後重連，還是會收到舊topic的訊息。因為訂閱是存在遠端broker上的，重連時會沿用舊的session，而bridge只會去訂閱新的topic，不會取消舊的，所以舊的訂閱還在。解決方法就是先把cleansession改成true重連一次，把舊的清掉，再改回false。</w:t>
       </w:r>
     </w:p>
     <w:p>
       <w:pPr>
         <w:spacing w:after="80"/>
-      </w:pPr>
-      <w:r>
-        <w:rPr>
-          <w:rFonts w:ascii="Times New Roman" w:hAnsi="Times New Roman" w:cs="Times New Roman" w:eastAsia="標楷體"/>
-          <w:b/>
-          <w:color w:val="1F4E79"/>
-        </w:rPr>
-        <w:t>(2) cleansession 為 false 時更改訂閱主題的意外行為</w:t>
-      </w:r>
-    </w:p>
-    <w:p>
-      <w:pPr>
-        <w:spacing w:after="80"/>
-        <w:ind w:left="288"/>
       </w:pPr>
       <w:r>
         <w:rPr>
           <w:rFonts w:ascii="Times New Roman" w:hAnsi="Times New Roman" w:cs="Times New Roman" w:eastAsia="標楷體"/>
           <w:b w:val="0"/>
-          <w:color w:val="1F4E79"/>
-        </w:rPr>
-        <w:t xml:space="preserve">現象：修改 bridge 的 topic 設定（例如把 </w:t>
-      </w:r>
-      <w:r>
-        <w:rPr>
-          <w:rFonts w:ascii="Courier New" w:hAnsi="Courier New" w:cs="Courier New" w:eastAsia="標楷體"/>
-          <w:b w:val="0"/>
-          <w:color w:val="1F4E79"/>
-        </w:rPr>
-        <w:t>topic sensor/# in</w:t>
-      </w:r>
+        </w:rPr>
+        <w:t>3. retained message是publish時有加retain旗標（例如 mosquitto_pub -r）的訊息，broker會把每個topic最後一筆retained message存起來，之後只要有人訂閱這個topic就會馬上收到這一筆。設成true的話每次重連都要重新訂閱，而每訂閱一次，broker就會把符合的retained message全部再送一次。bridge通常是訂閱 # 這種範圍很大的topic，所以只要重連次數一多，就會一直收到一大堆retained message。</w:t>
+      </w:r>
+    </w:p>
+    <w:p>
+      <w:pPr>
+        <w:spacing w:after="0"/>
+      </w:pPr>
       <w:r>
         <w:rPr>
           <w:rFonts w:ascii="Times New Roman" w:hAnsi="Times New Roman" w:cs="Times New Roman" w:eastAsia="標楷體"/>
           <w:b w:val="0"/>
-          <w:color w:val="1F4E79"/>
-        </w:rPr>
-        <w:t xml:space="preserve"> 改成 </w:t>
-      </w:r>
-      <w:r>
-        <w:rPr>
-          <w:rFonts w:ascii="Courier New" w:hAnsi="Courier New" w:cs="Courier New" w:eastAsia="標楷體"/>
-          <w:b w:val="0"/>
-          <w:color w:val="1F4E79"/>
-        </w:rPr>
-        <w:t>topic light/# in</w:t>
-      </w:r>
+        </w:rPr>
+      </w:r>
+    </w:p>
+    <w:p>
+      <w:pPr>
+        <w:rPr>
+          <w:rFonts w:ascii="Times New Roman" w:eastAsia="標楷體" w:hAnsi="Times New Roman" w:cs="Times New Roman"/>
+          <w:b/>
+          <w:sz w:val="28"/>
+        </w:rPr>
+      </w:pPr>
+      <w:r>
+        <w:rPr>
+          <w:rFonts w:ascii="Times New Roman" w:eastAsia="標楷體" w:hAnsi="Times New Roman" w:cs="Times New Roman"/>
+          <w:b/>
+          <w:sz w:val="28"/>
+        </w:rPr>
+        <w:t>Q</w:t>
+      </w:r>
+      <w:r>
+        <w:rPr>
+          <w:rFonts w:ascii="Times New Roman" w:eastAsia="標楷體" w:hAnsi="Times New Roman" w:cs="Times New Roman" w:hint="eastAsia"/>
+          <w:b/>
+          <w:sz w:val="28"/>
+        </w:rPr>
+        <w:t>7</w:t>
+      </w:r>
+      <w:r>
+        <w:rPr>
+          <w:rFonts w:ascii="Times New Roman" w:eastAsia="標楷體" w:hAnsi="Times New Roman" w:cs="Times New Roman"/>
+          <w:b/>
+          <w:sz w:val="28"/>
+        </w:rPr>
+        <w:t>.</w:t>
+      </w:r>
+      <w:r>
+        <w:rPr>
+          <w:rFonts w:ascii="Times New Roman" w:eastAsia="標楷體" w:hAnsi="Times New Roman" w:cs="Times New Roman"/>
+          <w:b/>
+          <w:sz w:val="28"/>
+        </w:rPr>
+        <w:t>心得</w:t>
+      </w:r>
+      <w:r>
+        <w:rPr>
+          <w:rFonts w:ascii="Times New Roman" w:eastAsia="標楷體" w:hAnsi="Times New Roman" w:cs="Times New Roman"/>
+          <w:b/>
+          <w:sz w:val="28"/>
+        </w:rPr>
+        <w:t>:</w:t>
+      </w:r>
+    </w:p>
+    <w:p>
+      <w:pPr>
+        <w:spacing w:after="80"/>
+      </w:pPr>
       <w:r>
         <w:rPr>
           <w:rFonts w:ascii="Times New Roman" w:hAnsi="Times New Roman" w:cs="Times New Roman" w:eastAsia="標楷體"/>
           <w:b w:val="0"/>
-          <w:color w:val="1F4E79"/>
-        </w:rPr>
-        <w:t>）並重連後，除了新的主題，仍會繼續收到「舊主題」的訊息，而且在設定檔裡已經找不到這條規則。</w:t>
+        </w:rPr>
+        <w:t>這次實驗學到MQTT的基本用法。一開始在設定VM的時候，因為VM沒有關機，網路跟處理器的設定都不能改，關機後才改得了。做pub/sub的時候，我一開始把sub和pub開在同一個terminal，sub跑起來之後按Ctrl+C跳出來再pub，當然收不到，後來才知道要開兩個terminal，一個負責訂閱、一個負責發布。</w:t>
       </w:r>
     </w:p>
     <w:p>
       <w:pPr>
         <w:spacing w:after="80"/>
-        <w:ind w:left="288"/>
       </w:pPr>
       <w:r>
         <w:rPr>
           <w:rFonts w:ascii="Times New Roman" w:hAnsi="Times New Roman" w:cs="Times New Roman" w:eastAsia="標楷體"/>
           <w:b w:val="0"/>
-          <w:color w:val="1F4E79"/>
-        </w:rPr>
-        <w:t>原因：session 是保存在「遠端 broker」上的。false 時重連會沿用舊 session，遠端 broker 仍記得舊的訂閱；bridge 重連時只會送出新設定中的 SUBSCRIBE，並不知道要去 UNSUBSCRIBE 已經從設定檔刪掉的舊主題，所以新舊訂閱同時存在。</w:t>
-      </w:r>
-    </w:p>
-    <w:p>
-      <w:pPr>
-        <w:spacing w:after="80"/>
-        <w:ind w:left="288"/>
-      </w:pPr>
-      <w:r>
-        <w:rPr>
-          <w:rFonts w:ascii="Times New Roman" w:hAnsi="Times New Roman" w:cs="Times New Roman" w:eastAsia="標楷體"/>
-          <w:b w:val="0"/>
-          <w:color w:val="1F4E79"/>
-        </w:rPr>
-        <w:t>解決：先把 cleansession 設為 true 並重啟讓 bridge 重新連線，遠端就會清掉舊 session（含舊訂閱）；確認之後再改回 false、重啟一次，恢復正常的持久 session。</w:t>
-      </w:r>
-    </w:p>
-    <w:p>
-      <w:pPr>
-        <w:spacing w:after="80"/>
-      </w:pPr>
-      <w:r>
-        <w:rPr>
-          <w:rFonts w:ascii="Times New Roman" w:hAnsi="Times New Roman" w:cs="Times New Roman" w:eastAsia="標楷體"/>
-          <w:b/>
-          <w:color w:val="1F4E79"/>
-        </w:rPr>
-        <w:t>(3) 保留訊息（retained messages）與大量重送</w:t>
-      </w:r>
-    </w:p>
-    <w:p>
-      <w:pPr>
-        <w:spacing w:after="80"/>
-        <w:ind w:left="288"/>
-      </w:pPr>
-      <w:r>
-        <w:rPr>
-          <w:rFonts w:ascii="Times New Roman" w:hAnsi="Times New Roman" w:cs="Times New Roman" w:eastAsia="標楷體"/>
-          <w:b w:val="0"/>
-          <w:color w:val="1F4E79"/>
-        </w:rPr>
-        <w:t xml:space="preserve">保留訊息：publish 時設定 retain 旗標（如 </w:t>
-      </w:r>
-      <w:r>
-        <w:rPr>
-          <w:rFonts w:ascii="Courier New" w:hAnsi="Courier New" w:cs="Courier New" w:eastAsia="標楷體"/>
-          <w:b w:val="0"/>
-          <w:color w:val="1F4E79"/>
-        </w:rPr>
-        <w:t>mosquitto_pub -r</w:t>
-      </w:r>
-      <w:r>
-        <w:rPr>
-          <w:rFonts w:ascii="Times New Roman" w:hAnsi="Times New Roman" w:cs="Times New Roman" w:eastAsia="標楷體"/>
-          <w:b w:val="0"/>
-          <w:color w:val="1F4E79"/>
-        </w:rPr>
-        <w:t>），broker 會為該 topic 保存「最後一筆」保留訊息；之後任何 client 一訂閱到符合的 topic，broker 就立刻把這筆訊息送給它，讓新訂閱者不用等下一次更新就能拿到最新狀態（例如裝置目前的溫度、開關狀態）。</w:t>
-      </w:r>
-    </w:p>
-    <w:p>
-      <w:pPr>
-        <w:spacing w:after="80"/>
-        <w:ind w:left="288"/>
-      </w:pPr>
-      <w:r>
-        <w:rPr>
-          <w:rFonts w:ascii="Times New Roman" w:hAnsi="Times New Roman" w:cs="Times New Roman" w:eastAsia="標楷體"/>
-          <w:b w:val="0"/>
-          <w:color w:val="1F4E79"/>
-        </w:rPr>
-        <w:t>為何 true 時會大量發送：cleansession 為 true 時，每次斷線後遠端都會把訂閱清掉，所以 bridge 每次重連都必須「重新訂閱」。而每一次新的訂閱都會觸發 broker 把所有符合主題的保留訊息整批送出；bridge 常用「#」這類範圍很大的萬用字元，涵蓋的保留訊息可能非常多，網路不穩頻繁重連時，就會一次又一次收到大量重複的保留訊息。false 時訂閱一直保留、不需重新訂閱，就不會發生這種情況。</w:t>
-      </w:r>
-    </w:p>
-    <w:p>
-      <w:pPr>
-        <w:spacing w:after="0"/>
-      </w:pPr>
-      <w:r>
-        <w:rPr>
-          <w:rFonts w:ascii="Times New Roman" w:hAnsi="Times New Roman" w:cs="Times New Roman" w:eastAsia="標楷體"/>
-          <w:b w:val="0"/>
-          <w:color w:val="1F4E79"/>
-        </w:rPr>
-      </w:r>
-    </w:p>
-    <w:p>
-      <w:pPr>
-        <w:rPr>
-          <w:rFonts w:ascii="Times New Roman" w:eastAsia="標楷體" w:hAnsi="Times New Roman" w:cs="Times New Roman"/>
-          <w:b/>
-          <w:sz w:val="28"/>
-        </w:rPr>
-      </w:pPr>
-      <w:r>
-        <w:rPr>
-          <w:rFonts w:ascii="Times New Roman" w:eastAsia="標楷體" w:hAnsi="Times New Roman" w:cs="Times New Roman"/>
-          <w:b/>
-          <w:sz w:val="28"/>
-        </w:rPr>
-        <w:t>Q</w:t>
-      </w:r>
-      <w:r>
-        <w:rPr>
-          <w:rFonts w:ascii="Times New Roman" w:eastAsia="標楷體" w:hAnsi="Times New Roman" w:cs="Times New Roman" w:hint="eastAsia"/>
-          <w:b/>
-          <w:sz w:val="28"/>
-        </w:rPr>
-        <w:t>7</w:t>
-      </w:r>
-      <w:r>
-        <w:rPr>
-          <w:rFonts w:ascii="Times New Roman" w:eastAsia="標楷體" w:hAnsi="Times New Roman" w:cs="Times New Roman"/>
-          <w:b/>
-          <w:sz w:val="28"/>
-        </w:rPr>
-        <w:t>.</w:t>
-      </w:r>
-      <w:r>
-        <w:rPr>
-          <w:rFonts w:ascii="Times New Roman" w:eastAsia="標楷體" w:hAnsi="Times New Roman" w:cs="Times New Roman"/>
-          <w:b/>
-          <w:sz w:val="28"/>
-        </w:rPr>
-        <w:t>心得</w:t>
-      </w:r>
-      <w:r>
-        <w:rPr>
-          <w:rFonts w:ascii="Times New Roman" w:eastAsia="標楷體" w:hAnsi="Times New Roman" w:cs="Times New Roman"/>
-          <w:b/>
-          <w:sz w:val="28"/>
-        </w:rPr>
-        <w:t>:</w:t>
-      </w:r>
-    </w:p>
-    <w:p>
-      <w:pPr>
-        <w:spacing w:after="80"/>
-      </w:pPr>
-      <w:r>
-        <w:rPr>
-          <w:rFonts w:ascii="Times New Roman" w:hAnsi="Times New Roman" w:cs="Times New Roman" w:eastAsia="標楷體"/>
-          <w:b w:val="0"/>
-          <w:color w:val="1F4E79"/>
-        </w:rPr>
-        <w:t>這次實驗實際操作了 MQTT 的 publish / subscribe、帳號驗證與 bridge。Q1 讓我注意到 topic 開頭多一個「/」就等於多了一層空字串，看起來很像的 /a/test 和 a/test 其實完全不同；Q2 則熟悉了「+」只代表單一層、「#」代表之後所有層的差別，用實際發送 36 種 topic 驗證每個 subscriber 收到的筆數，比只在紙上推比較有把握。</w:t>
-      </w:r>
-    </w:p>
-    <w:p>
-      <w:pPr>
-        <w:spacing w:after="80"/>
-      </w:pPr>
-      <w:r>
-        <w:rPr>
-          <w:rFonts w:ascii="Times New Roman" w:hAnsi="Times New Roman" w:cs="Times New Roman" w:eastAsia="標楷體"/>
-          <w:b w:val="0"/>
-          <w:color w:val="1F4E79"/>
-        </w:rPr>
-        <w:t>設定帳號密碼時遇到一個坑：新版 mosquitto（2.x）如果設定檔沒有寫 listener，會進入 local only mode，allow_anonymous false 不會生效，匿名使用者照樣可以連線，加上 listener 1883 之後才正確擋下。另外 passwd 檔不存在或 broker 沒有權限讀取時，mosquitto 會直接啟動失敗，client 只看到 Connection refused，要去看 log 才知道原因。</w:t>
-      </w:r>
-    </w:p>
-    <w:p>
-      <w:pPr>
-        <w:spacing w:after="80"/>
-      </w:pPr>
-      <w:r>
-        <w:rPr>
-          <w:rFonts w:ascii="Times New Roman" w:hAnsi="Times New Roman" w:cs="Times New Roman" w:eastAsia="標楷體"/>
-          <w:b w:val="0"/>
-          <w:color w:val="1F4E79"/>
-        </w:rPr>
-        <w:t>Bridge 的部分最有收穫。out/in 方向搭配 local-prefix、remote-prefix 可以讓兩個 broker 之間只分享部分主題並重新命名，例如 out/msg 到 B 變成 fromA/msg、B 的所有訊息到 A 都加上 fromB/。其中 topic 為 out 的訊息也會被轉送成 fromA/out，是因為「#」也會匹配上一層本身，這是實際測試後才發現的細節。整體而言，MQTT 架構簡單、傳輸量小，透過 broker 讓發佈者與訂閱者互不需要知道對方位址，很適合 IoT 裝置之間的溝通。</w:t>
+        </w:rPr>
+        <w:t>Q1原本覺得 /a/test 跟 a/test 應該差不多，實際測了才知道開頭多一個 / 就會多一層。Q2用 + 和 # 去篩選topic還蠻直觀的。bridge的部分比較複雜，out、in再加上prefix的轉換要想一下，像msg2的topic是 out 也會被送出去這點一開始沒想到，測完才搞懂。整體來說MQTT設定起來不難，pub跟sub只要知道broker的IP就可以溝通，蠻適合用在IoT上的。</w:t>
       </w:r>
     </w:p>
     <w:sectPr>

</xml_diff>

<commit_message>
Q4: keep table and explanation only
Co-Authored-By: Claude Opus 5.5 <noreply@anthropic.com>
Claude-Session: https://claude.ai/code/session_01Qk1r5LCPhzPwNxHsC9nyKE
</commit_message>
<xml_diff>
--- a/lab3/Lab_3_report.docx
+++ b/lab3/Lab_3_report.docx
@@ -2069,7 +2069,7 @@
           <w:rFonts w:ascii="Times New Roman" w:hAnsi="Times New Roman" w:cs="Times New Roman" w:eastAsia="標楷體"/>
           <w:b w:val="0"/>
         </w:rPr>
-        <w:t>3. msg2的topic只有 out，本來以為不會送過去，結果B收到 fromA/out。查了一下是因為 # 也會匹配上一層本身，所以 out 也符合 out/#，只是它沒有 out/ 可以換，就直接在前面加上 fromA/。</w:t>
+        <w:t>3. msg2的topic只有 out，因為 # 也會匹配上一層本身，所以 out 也符合 out/#，會被送到B，只是它沒有 out/ 可以換，就直接在前面加上 fromA/，B收到的是 fromA/out。</w:t>
       </w:r>
     </w:p>
     <w:p>
@@ -2096,124 +2096,6 @@
           <w:b w:val="0"/>
         </w:rPr>
         <w:t>5. in那行只有設local-prefix，所以B上的所有訊息都會傳回A，而且前面加上 fromB/，msg5、msg6在A分別變成 fromB/out 和 fromB/fromB，B自己則是照原本的topic顯示。</w:t>
-      </w:r>
-    </w:p>
-    <w:p>
-      <w:pPr>
-        <w:jc w:val="center"/>
-      </w:pPr>
-      <w:r>
-        <w:drawing>
-          <wp:inline xmlns:a="http://schemas.openxmlformats.org/drawingml/2006/main" xmlns:pic="http://schemas.openxmlformats.org/drawingml/2006/picture">
-            <wp:extent cx="5257800" cy="1537249"/>
-            <wp:docPr id="5" name="Picture 5"/>
-            <wp:cNvGraphicFramePr>
-              <a:graphicFrameLocks noChangeAspect="1"/>
-            </wp:cNvGraphicFramePr>
-            <a:graphic>
-              <a:graphicData uri="http://schemas.openxmlformats.org/drawingml/2006/picture">
-                <pic:pic>
-                  <pic:nvPicPr>
-                    <pic:cNvPr id="0" name="img_q4a.png"/>
-                    <pic:cNvPicPr/>
-                  </pic:nvPicPr>
-                  <pic:blipFill>
-                    <a:blip r:embed="rId13"/>
-                    <a:stretch>
-                      <a:fillRect/>
-                    </a:stretch>
-                  </pic:blipFill>
-                  <pic:spPr>
-                    <a:xfrm>
-                      <a:off x="0" y="0"/>
-                      <a:ext cx="5257800" cy="1537249"/>
-                    </a:xfrm>
-                    <a:prstGeom prst="rect"/>
-                  </pic:spPr>
-                </pic:pic>
-              </a:graphicData>
-            </a:graphic>
-          </wp:inline>
-        </w:drawing>
-      </w:r>
-    </w:p>
-    <w:p>
-      <w:pPr>
-        <w:spacing w:after="160"/>
-        <w:jc w:val="center"/>
-      </w:pPr>
-      <w:r>
-        <w:rPr>
-          <w:rFonts w:ascii="Times New Roman" w:hAnsi="Times New Roman" w:cs="Times New Roman" w:eastAsia="標楷體"/>
-          <w:b w:val="0"/>
-          <w:sz w:val="20"/>
-        </w:rPr>
-        <w:t>圖5  在A加上bridge設定</w:t>
-      </w:r>
-    </w:p>
-    <w:p>
-      <w:pPr>
-        <w:jc w:val="center"/>
-      </w:pPr>
-      <w:r>
-        <w:drawing>
-          <wp:inline xmlns:a="http://schemas.openxmlformats.org/drawingml/2006/main" xmlns:pic="http://schemas.openxmlformats.org/drawingml/2006/picture">
-            <wp:extent cx="5257800" cy="1759459"/>
-            <wp:docPr id="6" name="Picture 6"/>
-            <wp:cNvGraphicFramePr>
-              <a:graphicFrameLocks noChangeAspect="1"/>
-            </wp:cNvGraphicFramePr>
-            <a:graphic>
-              <a:graphicData uri="http://schemas.openxmlformats.org/drawingml/2006/picture">
-                <pic:pic>
-                  <pic:nvPicPr>
-                    <pic:cNvPr id="0" name="img_q4b.png"/>
-                    <pic:cNvPicPr/>
-                  </pic:nvPicPr>
-                  <pic:blipFill>
-                    <a:blip r:embed="rId14"/>
-                    <a:stretch>
-                      <a:fillRect/>
-                    </a:stretch>
-                  </pic:blipFill>
-                  <pic:spPr>
-                    <a:xfrm>
-                      <a:off x="0" y="0"/>
-                      <a:ext cx="5257800" cy="1759459"/>
-                    </a:xfrm>
-                    <a:prstGeom prst="rect"/>
-                  </pic:spPr>
-                </pic:pic>
-              </a:graphicData>
-            </a:graphic>
-          </wp:inline>
-        </w:drawing>
-      </w:r>
-    </w:p>
-    <w:p>
-      <w:pPr>
-        <w:spacing w:after="160"/>
-        <w:jc w:val="center"/>
-      </w:pPr>
-      <w:r>
-        <w:rPr>
-          <w:rFonts w:ascii="Times New Roman" w:hAnsi="Times New Roman" w:cs="Times New Roman" w:eastAsia="標楷體"/>
-          <w:b w:val="0"/>
-          <w:sz w:val="20"/>
-        </w:rPr>
-        <w:t>圖6  Q4測試結果</w:t>
-      </w:r>
-    </w:p>
-    <w:p>
-      <w:pPr>
-        <w:spacing w:after="80"/>
-      </w:pPr>
-      <w:r>
-        <w:rPr>
-          <w:rFonts w:ascii="Times New Roman" w:hAnsi="Times New Roman" w:cs="Times New Roman" w:eastAsia="標楷體"/>
-          <w:b w:val="0"/>
-        </w:rPr>
-        <w:t>註：這次的Broker B是用同一台電腦上port 1884的mosquitto代替Pi板。</w:t>
       </w:r>
     </w:p>
     <w:p>
@@ -3232,7 +3114,7 @@
           <w:rFonts w:ascii="Times New Roman" w:hAnsi="Times New Roman" w:cs="Times New Roman" w:eastAsia="標楷體"/>
           <w:b w:val="0"/>
         </w:rPr>
-        <w:t>Q1原本覺得 /a/test 跟 a/test 應該差不多，實際測了才知道開頭多一個 / 就會多一層。Q2用 + 和 # 去篩選topic還蠻直觀的。bridge的部分比較複雜，out、in再加上prefix的轉換要想一下，像msg2的topic是 out 也會被送出去這點一開始沒想到，測完才搞懂。整體來說MQTT設定起來不難，pub跟sub只要知道broker的IP就可以溝通，蠻適合用在IoT上的。</w:t>
+        <w:t>Q1原本覺得 /a/test 跟 a/test 應該差不多，實際測了才知道開頭多一個 / 就會多一層。Q2用 + 和 # 去篩選topic還蠻直觀的。bridge的部分比較複雜，out、in再加上prefix的轉換要想一下，像msg2的topic是 out 也會被送出去這點一開始沒想到，後來才搞懂。整體來說MQTT設定起來不難，pub跟sub只要知道broker的IP就可以溝通，蠻適合用在IoT上的。</w:t>
       </w:r>
     </w:p>
     <w:sectPr>

</xml_diff>

<commit_message>
Q4: drop bridge config block, reference topic rules in discussion
Co-Authored-By: Claude Opus 5.5 <noreply@anthropic.com>
Claude-Session: https://claude.ai/code/session_01Qk1r5LCPhzPwNxHsC9nyKE
</commit_message>
<xml_diff>
--- a/lab3/Lab_3_report.docx
+++ b/lab3/Lab_3_report.docx
@@ -1955,147 +1955,72 @@
           <w:rFonts w:ascii="Times New Roman" w:hAnsi="Times New Roman" w:cs="Times New Roman" w:eastAsia="標楷體"/>
           <w:b w:val="0"/>
         </w:rPr>
-        <w:t>Bridge設在A（VM），設定如下：</w:t>
-      </w:r>
-    </w:p>
-    <w:p>
-      <w:pPr>
-        <w:spacing w:after="0"/>
-        <w:ind w:left="432"/>
+        <w:t>結果討論：</w:t>
+      </w:r>
+    </w:p>
+    <w:p>
+      <w:pPr>
+        <w:spacing w:after="80"/>
+        <w:ind w:left="288"/>
       </w:pPr>
       <w:r>
         <w:rPr>
           <w:rFonts w:ascii="Times New Roman" w:hAnsi="Times New Roman" w:cs="Times New Roman" w:eastAsia="標楷體"/>
           <w:b w:val="0"/>
         </w:rPr>
-        <w:t>connection bridge-01</w:t>
-      </w:r>
-    </w:p>
-    <w:p>
-      <w:pPr>
-        <w:spacing w:after="0"/>
-        <w:ind w:left="432"/>
+        <w:t>1. A的subscriber訂閱 #，所以A自己pub的訊息都會照原本的topic顯示。</w:t>
+      </w:r>
+    </w:p>
+    <w:p>
+      <w:pPr>
+        <w:spacing w:after="80"/>
+        <w:ind w:left="288"/>
       </w:pPr>
       <w:r>
         <w:rPr>
           <w:rFonts w:ascii="Times New Roman" w:hAnsi="Times New Roman" w:cs="Times New Roman" w:eastAsia="標楷體"/>
           <w:b w:val="0"/>
         </w:rPr>
-        <w:t>address &lt;Pi板IP&gt;:1883</w:t>
-      </w:r>
-    </w:p>
-    <w:p>
-      <w:pPr>
-        <w:spacing w:after="0"/>
-        <w:ind w:left="432"/>
+        <w:t>2. topic # out 1 out/ fromA/ 的意思是A上 out/ 開頭的訊息會送到B，而且 out/ 會換成 fromA/，所以msg3在B變成 fromA/msg。</w:t>
+      </w:r>
+    </w:p>
+    <w:p>
+      <w:pPr>
+        <w:spacing w:after="80"/>
+        <w:ind w:left="288"/>
       </w:pPr>
       <w:r>
         <w:rPr>
           <w:rFonts w:ascii="Times New Roman" w:hAnsi="Times New Roman" w:cs="Times New Roman" w:eastAsia="標楷體"/>
           <w:b w:val="0"/>
         </w:rPr>
-        <w:t>topic # out 1 out/ fromA/</w:t>
-      </w:r>
-    </w:p>
-    <w:p>
-      <w:pPr>
-        <w:spacing w:after="0"/>
-        <w:ind w:left="432"/>
+        <w:t>3. msg2的topic只有 out，因為 # 也會匹配上一層本身，所以 out 也符合 out/#，會被送到B，只是它沒有 out/ 可以換，就直接在前面加上 fromA/，B收到的是 fromA/out。</w:t>
+      </w:r>
+    </w:p>
+    <w:p>
+      <w:pPr>
+        <w:spacing w:after="80"/>
+        <w:ind w:left="288"/>
       </w:pPr>
       <w:r>
         <w:rPr>
           <w:rFonts w:ascii="Times New Roman" w:hAnsi="Times New Roman" w:cs="Times New Roman" w:eastAsia="標楷體"/>
           <w:b w:val="0"/>
         </w:rPr>
-        <w:t>topic # in 1 fromB/</w:t>
-      </w:r>
-    </w:p>
-    <w:p>
-      <w:pPr>
-        <w:spacing w:after="0"/>
+        <w:t>4. msg1（in）和msg4（/out）都不符合 out/#，所以只有A收得到，B收不到。</w:t>
+      </w:r>
+    </w:p>
+    <w:p>
+      <w:pPr>
+        <w:spacing w:after="80"/>
+        <w:ind w:left="288"/>
       </w:pPr>
       <w:r>
         <w:rPr>
           <w:rFonts w:ascii="Times New Roman" w:hAnsi="Times New Roman" w:cs="Times New Roman" w:eastAsia="標楷體"/>
           <w:b w:val="0"/>
         </w:rPr>
-      </w:r>
-    </w:p>
-    <w:p>
-      <w:pPr>
-        <w:spacing w:after="80"/>
-      </w:pPr>
-      <w:r>
-        <w:rPr>
-          <w:rFonts w:ascii="Times New Roman" w:hAnsi="Times New Roman" w:cs="Times New Roman" w:eastAsia="標楷體"/>
-          <w:b w:val="0"/>
-        </w:rPr>
-        <w:t>結果討論：</w:t>
-      </w:r>
-    </w:p>
-    <w:p>
-      <w:pPr>
-        <w:spacing w:after="80"/>
-        <w:ind w:left="288"/>
-      </w:pPr>
-      <w:r>
-        <w:rPr>
-          <w:rFonts w:ascii="Times New Roman" w:hAnsi="Times New Roman" w:cs="Times New Roman" w:eastAsia="標楷體"/>
-          <w:b w:val="0"/>
-        </w:rPr>
-        <w:t>1. A的subscriber訂閱 #，所以A自己pub的訊息都會照原本的topic顯示。</w:t>
-      </w:r>
-    </w:p>
-    <w:p>
-      <w:pPr>
-        <w:spacing w:after="80"/>
-        <w:ind w:left="288"/>
-      </w:pPr>
-      <w:r>
-        <w:rPr>
-          <w:rFonts w:ascii="Times New Roman" w:hAnsi="Times New Roman" w:cs="Times New Roman" w:eastAsia="標楷體"/>
-          <w:b w:val="0"/>
-        </w:rPr>
-        <w:t>2. out那行的意思是A上 out/ 開頭的訊息會送到B，而且 out/ 會換成 fromA/，所以msg3在B變成 fromA/msg。</w:t>
-      </w:r>
-    </w:p>
-    <w:p>
-      <w:pPr>
-        <w:spacing w:after="80"/>
-        <w:ind w:left="288"/>
-      </w:pPr>
-      <w:r>
-        <w:rPr>
-          <w:rFonts w:ascii="Times New Roman" w:hAnsi="Times New Roman" w:cs="Times New Roman" w:eastAsia="標楷體"/>
-          <w:b w:val="0"/>
-        </w:rPr>
-        <w:t>3. msg2的topic只有 out，因為 # 也會匹配上一層本身，所以 out 也符合 out/#，會被送到B，只是它沒有 out/ 可以換，就直接在前面加上 fromA/，B收到的是 fromA/out。</w:t>
-      </w:r>
-    </w:p>
-    <w:p>
-      <w:pPr>
-        <w:spacing w:after="80"/>
-        <w:ind w:left="288"/>
-      </w:pPr>
-      <w:r>
-        <w:rPr>
-          <w:rFonts w:ascii="Times New Roman" w:hAnsi="Times New Roman" w:cs="Times New Roman" w:eastAsia="標楷體"/>
-          <w:b w:val="0"/>
-        </w:rPr>
-        <w:t>4. msg1（in）和msg4（/out）都不符合 out/#，所以只有A收得到，B收不到。</w:t>
-      </w:r>
-    </w:p>
-    <w:p>
-      <w:pPr>
-        <w:spacing w:after="80"/>
-        <w:ind w:left="288"/>
-      </w:pPr>
-      <w:r>
-        <w:rPr>
-          <w:rFonts w:ascii="Times New Roman" w:hAnsi="Times New Roman" w:cs="Times New Roman" w:eastAsia="標楷體"/>
-          <w:b w:val="0"/>
-        </w:rPr>
-        <w:t>5. in那行只有設local-prefix，所以B上的所有訊息都會傳回A，而且前面加上 fromB/，msg5、msg6在A分別變成 fromB/out 和 fromB/fromB，B自己則是照原本的topic顯示。</w:t>
+        <w:t>5. topic # in 1 fromB/ 只有設local-prefix，所以B上的所有訊息都會傳回A，而且前面加上 fromB/，msg5、msg6在A分別變成 fromB/out 和 fromB/fromB，B自己則是照原本的topic顯示。</w:t>
       </w:r>
     </w:p>
     <w:p>

</xml_diff>

<commit_message>
Use VM screenshots for Q1 and Q2; adjust Q1 wording
Co-Authored-By: Claude Opus 5.5 <noreply@anthropic.com>
Claude-Session: https://claude.ai/code/session_01Qk1r5LCPhzPwNxHsC9nyKE
</commit_message>
<xml_diff>
--- a/lab3/Lab_3_report.docx
+++ b/lab3/Lab_3_report.docx
@@ -259,7 +259,7 @@
           <w:rFonts w:ascii="Times New Roman" w:hAnsi="Times New Roman" w:cs="Times New Roman" w:eastAsia="標楷體"/>
           <w:b w:val="0"/>
         </w:rPr>
-        <w:t>實際測試時，pub 到 a/test 的 test_q1 沒有收到，改 pub 到 /a/test 才有收到。</w:t>
+        <w:t>實際測試時，pub 到 a/test 的 test_q1，訂閱 /a/test 的那邊沒有收到。</w:t>
       </w:r>
     </w:p>
     <w:p>
@@ -269,7 +269,7 @@
       <w:r>
         <w:drawing>
           <wp:inline xmlns:a="http://schemas.openxmlformats.org/drawingml/2006/main" xmlns:pic="http://schemas.openxmlformats.org/drawingml/2006/picture">
-            <wp:extent cx="5257800" cy="795348"/>
+            <wp:extent cx="4114800" cy="1232024"/>
             <wp:docPr id="1" name="Picture 1"/>
             <wp:cNvGraphicFramePr>
               <a:graphicFrameLocks noChangeAspect="1"/>
@@ -278,7 +278,7 @@
               <a:graphicData uri="http://schemas.openxmlformats.org/drawingml/2006/picture">
                 <pic:pic>
                   <pic:nvPicPr>
-                    <pic:cNvPr id="0" name="img_q1.png"/>
+                    <pic:cNvPr id="0" name="img_q1_vm.png"/>
                     <pic:cNvPicPr/>
                   </pic:nvPicPr>
                   <pic:blipFill>
@@ -290,7 +290,7 @@
                   <pic:spPr>
                     <a:xfrm>
                       <a:off x="0" y="0"/>
-                      <a:ext cx="5257800" cy="795348"/>
+                      <a:ext cx="4114800" cy="1232024"/>
                     </a:xfrm>
                     <a:prstGeom prst="rect"/>
                   </pic:spPr>
@@ -1005,7 +1005,7 @@
       <w:r>
         <w:drawing>
           <wp:inline xmlns:a="http://schemas.openxmlformats.org/drawingml/2006/main" xmlns:pic="http://schemas.openxmlformats.org/drawingml/2006/picture">
-            <wp:extent cx="5257800" cy="3518819"/>
+            <wp:extent cx="3931920" cy="5478181"/>
             <wp:docPr id="2" name="Picture 2"/>
             <wp:cNvGraphicFramePr>
               <a:graphicFrameLocks noChangeAspect="1"/>
@@ -1014,7 +1014,7 @@
               <a:graphicData uri="http://schemas.openxmlformats.org/drawingml/2006/picture">
                 <pic:pic>
                   <pic:nvPicPr>
-                    <pic:cNvPr id="0" name="img_q2.png"/>
+                    <pic:cNvPr id="0" name="img_q2_vm.png"/>
                     <pic:cNvPicPr/>
                   </pic:nvPicPr>
                   <pic:blipFill>
@@ -1026,7 +1026,7 @@
                   <pic:spPr>
                     <a:xfrm>
                       <a:off x="0" y="0"/>
-                      <a:ext cx="5257800" cy="3518819"/>
+                      <a:ext cx="3931920" cy="5478181"/>
                     </a:xfrm>
                     <a:prstGeom prst="rect"/>
                   </pic:spPr>

</xml_diff>

<commit_message>
Use VM screenshots for Q3
Co-Authored-By: Claude Opus 5.5 <noreply@anthropic.com>
Claude-Session: https://claude.ai/code/session_01Qk1r5LCPhzPwNxHsC9nyKE
</commit_message>
<xml_diff>
--- a/lab3/Lab_3_report.docx
+++ b/lab3/Lab_3_report.docx
@@ -1175,7 +1175,7 @@
       <w:r>
         <w:drawing>
           <wp:inline xmlns:a="http://schemas.openxmlformats.org/drawingml/2006/main" xmlns:pic="http://schemas.openxmlformats.org/drawingml/2006/picture">
-            <wp:extent cx="5257800" cy="3896243"/>
+            <wp:extent cx="4754880" cy="2231219"/>
             <wp:docPr id="3" name="Picture 3"/>
             <wp:cNvGraphicFramePr>
               <a:graphicFrameLocks noChangeAspect="1"/>
@@ -1184,7 +1184,7 @@
               <a:graphicData uri="http://schemas.openxmlformats.org/drawingml/2006/picture">
                 <pic:pic>
                   <pic:nvPicPr>
-                    <pic:cNvPr id="0" name="img_q3a.png"/>
+                    <pic:cNvPr id="0" name="img_q3a_vm.png"/>
                     <pic:cNvPicPr/>
                   </pic:nvPicPr>
                   <pic:blipFill>
@@ -1196,7 +1196,7 @@
                   <pic:spPr>
                     <a:xfrm>
                       <a:off x="0" y="0"/>
-                      <a:ext cx="5257800" cy="3896243"/>
+                      <a:ext cx="4754880" cy="2231219"/>
                     </a:xfrm>
                     <a:prstGeom prst="rect"/>
                   </pic:spPr>
@@ -1218,7 +1218,7 @@
           <w:b w:val="0"/>
           <w:sz w:val="20"/>
         </w:rPr>
-        <w:t>圖3  建立帳號、修改設定檔並重啟</w:t>
+        <w:t>圖3  建立帳號</w:t>
       </w:r>
     </w:p>
     <w:p>
@@ -1228,7 +1228,7 @@
       <w:r>
         <w:drawing>
           <wp:inline xmlns:a="http://schemas.openxmlformats.org/drawingml/2006/main" xmlns:pic="http://schemas.openxmlformats.org/drawingml/2006/picture">
-            <wp:extent cx="5257800" cy="1975474"/>
+            <wp:extent cx="4206240" cy="2233502"/>
             <wp:docPr id="4" name="Picture 4"/>
             <wp:cNvGraphicFramePr>
               <a:graphicFrameLocks noChangeAspect="1"/>
@@ -1237,7 +1237,7 @@
               <a:graphicData uri="http://schemas.openxmlformats.org/drawingml/2006/picture">
                 <pic:pic>
                   <pic:nvPicPr>
-                    <pic:cNvPr id="0" name="img_q3b.png"/>
+                    <pic:cNvPr id="0" name="img_q3b_vm.png"/>
                     <pic:cNvPicPr/>
                   </pic:nvPicPr>
                   <pic:blipFill>
@@ -1249,7 +1249,7 @@
                   <pic:spPr>
                     <a:xfrm>
                       <a:off x="0" y="0"/>
-                      <a:ext cx="5257800" cy="1975474"/>
+                      <a:ext cx="4206240" cy="2233502"/>
                     </a:xfrm>
                     <a:prstGeom prst="rect"/>
                   </pic:spPr>
@@ -1271,7 +1271,60 @@
           <w:b w:val="0"/>
           <w:sz w:val="20"/>
         </w:rPr>
-        <w:t>圖4  匿名被拒絕，用帳密可以正常收發</w:t>
+        <w:t>圖4  修改設定檔並重啟</w:t>
+      </w:r>
+    </w:p>
+    <w:p>
+      <w:pPr>
+        <w:jc w:val="center"/>
+      </w:pPr>
+      <w:r>
+        <w:drawing>
+          <wp:inline xmlns:a="http://schemas.openxmlformats.org/drawingml/2006/main" xmlns:pic="http://schemas.openxmlformats.org/drawingml/2006/picture">
+            <wp:extent cx="4206240" cy="3653678"/>
+            <wp:docPr id="5" name="Picture 5"/>
+            <wp:cNvGraphicFramePr>
+              <a:graphicFrameLocks noChangeAspect="1"/>
+            </wp:cNvGraphicFramePr>
+            <a:graphic>
+              <a:graphicData uri="http://schemas.openxmlformats.org/drawingml/2006/picture">
+                <pic:pic>
+                  <pic:nvPicPr>
+                    <pic:cNvPr id="0" name="img_q3c_vm.png"/>
+                    <pic:cNvPicPr/>
+                  </pic:nvPicPr>
+                  <pic:blipFill>
+                    <a:blip r:embed="rId13"/>
+                    <a:stretch>
+                      <a:fillRect/>
+                    </a:stretch>
+                  </pic:blipFill>
+                  <pic:spPr>
+                    <a:xfrm>
+                      <a:off x="0" y="0"/>
+                      <a:ext cx="4206240" cy="3653678"/>
+                    </a:xfrm>
+                    <a:prstGeom prst="rect"/>
+                  </pic:spPr>
+                </pic:pic>
+              </a:graphicData>
+            </a:graphic>
+          </wp:inline>
+        </w:drawing>
+      </w:r>
+    </w:p>
+    <w:p>
+      <w:pPr>
+        <w:spacing w:after="160"/>
+        <w:jc w:val="center"/>
+      </w:pPr>
+      <w:r>
+        <w:rPr>
+          <w:rFonts w:ascii="Times New Roman" w:hAnsi="Times New Roman" w:cs="Times New Roman" w:eastAsia="標楷體"/>
+          <w:b w:val="0"/>
+          <w:sz w:val="20"/>
+        </w:rPr>
+        <w:t>圖5  匿名被拒絕，用帳密可以正常收發</w:t>
       </w:r>
     </w:p>
     <w:p>

</xml_diff>

<commit_message>
Add VM screenshot for Q4 bridge test
Co-Authored-By: Claude Opus 5.5 <noreply@anthropic.com>
Claude-Session: https://claude.ai/code/session_01Qk1r5LCPhzPwNxHsC9nyKE
</commit_message>
<xml_diff>
--- a/lab3/Lab_3_report.docx
+++ b/lab3/Lab_3_report.docx
@@ -2074,6 +2074,59 @@
           <w:b w:val="0"/>
         </w:rPr>
         <w:t>5. topic # in 1 fromB/ 只有設local-prefix，所以B上的所有訊息都會傳回A，而且前面加上 fromB/，msg5、msg6在A分別變成 fromB/out 和 fromB/fromB，B自己則是照原本的topic顯示。</w:t>
+      </w:r>
+    </w:p>
+    <w:p>
+      <w:pPr>
+        <w:jc w:val="center"/>
+      </w:pPr>
+      <w:r>
+        <w:drawing>
+          <wp:inline xmlns:a="http://schemas.openxmlformats.org/drawingml/2006/main" xmlns:pic="http://schemas.openxmlformats.org/drawingml/2006/picture">
+            <wp:extent cx="5212080" cy="2928551"/>
+            <wp:docPr id="6" name="Picture 6"/>
+            <wp:cNvGraphicFramePr>
+              <a:graphicFrameLocks noChangeAspect="1"/>
+            </wp:cNvGraphicFramePr>
+            <a:graphic>
+              <a:graphicData uri="http://schemas.openxmlformats.org/drawingml/2006/picture">
+                <pic:pic>
+                  <pic:nvPicPr>
+                    <pic:cNvPr id="0" name="img_q4_vm.png"/>
+                    <pic:cNvPicPr/>
+                  </pic:nvPicPr>
+                  <pic:blipFill>
+                    <a:blip r:embed="rId14"/>
+                    <a:stretch>
+                      <a:fillRect/>
+                    </a:stretch>
+                  </pic:blipFill>
+                  <pic:spPr>
+                    <a:xfrm>
+                      <a:off x="0" y="0"/>
+                      <a:ext cx="5212080" cy="2928551"/>
+                    </a:xfrm>
+                    <a:prstGeom prst="rect"/>
+                  </pic:spPr>
+                </pic:pic>
+              </a:graphicData>
+            </a:graphic>
+          </wp:inline>
+        </w:drawing>
+      </w:r>
+    </w:p>
+    <w:p>
+      <w:pPr>
+        <w:spacing w:after="160"/>
+        <w:jc w:val="center"/>
+      </w:pPr>
+      <w:r>
+        <w:rPr>
+          <w:rFonts w:ascii="Times New Roman" w:hAnsi="Times New Roman" w:cs="Times New Roman" w:eastAsia="標楷體"/>
+          <w:b w:val="0"/>
+          <w:sz w:val="20"/>
+        </w:rPr>
+        <w:t>圖6  Q4測試結果</w:t>
       </w:r>
     </w:p>
     <w:p>

</xml_diff>